<commit_message>
sửa một số lỗi bố cục
</commit_message>
<xml_diff>
--- a/baocao/tomtatvanban.docx
+++ b/baocao/tomtatvanban.docx
@@ -448,7 +448,7 @@
           <w:tab w:val="left" w:pos="567"/>
         </w:tabs>
         <w:spacing w:before="120"/>
-        <w:ind w:left="2841" w:right="2696"/>
+        <w:ind w:left="2841" w:right="2600"/>
         <w:jc w:val="center"/>
         <w:rPr>
           <w:b/>
@@ -717,50 +717,67 @@
         <w:ind w:left="125"/>
         <w:jc w:val="center"/>
         <w:rPr>
+          <w:bCs/>
+          <w:color w:val="000000"/>
+          <w:sz w:val="26"/>
+          <w:szCs w:val="26"/>
+          <w:lang w:val="en-US"/>
+        </w:rPr>
+      </w:pPr>
+      <w:r>
+        <w:rPr>
+          <w:bCs/>
+          <w:color w:val="000000"/>
+          <w:sz w:val="26"/>
+          <w:szCs w:val="26"/>
+        </w:rPr>
+        <w:t xml:space="preserve">Tháng </w:t>
+      </w:r>
+      <w:r>
+        <w:rPr>
+          <w:bCs/>
+          <w:color w:val="000000"/>
+          <w:sz w:val="26"/>
+          <w:szCs w:val="26"/>
+          <w:lang w:val="vi-VN"/>
+        </w:rPr>
+        <w:t>3</w:t>
+      </w:r>
+      <w:r>
+        <w:rPr>
+          <w:bCs/>
+          <w:color w:val="000000"/>
+          <w:sz w:val="26"/>
+          <w:szCs w:val="26"/>
+        </w:rPr>
+        <w:t>/202</w:t>
+      </w:r>
+      <w:r>
+        <w:rPr>
+          <w:bCs/>
+          <w:color w:val="000000"/>
+          <w:sz w:val="26"/>
+          <w:szCs w:val="26"/>
+          <w:lang w:val="vi-VN"/>
+        </w:rPr>
+        <w:t>6</w:t>
+      </w:r>
+    </w:p>
+    <w:p>
+      <w:pPr>
+        <w:tabs>
+          <w:tab w:val="left" w:pos="567"/>
+        </w:tabs>
+        <w:spacing w:before="120"/>
+        <w:ind w:left="125"/>
+        <w:jc w:val="center"/>
+        <w:rPr>
           <w:b/>
           <w:spacing w:val="-2"/>
           <w:sz w:val="25"/>
-          <w:lang w:val="vi-VN"/>
-        </w:rPr>
-      </w:pPr>
-      <w:r>
-        <w:rPr>
-          <w:bCs/>
-          <w:color w:val="000000"/>
-          <w:sz w:val="26"/>
-          <w:szCs w:val="26"/>
-        </w:rPr>
-        <w:t xml:space="preserve">Tháng </w:t>
-      </w:r>
-      <w:r>
-        <w:rPr>
-          <w:bCs/>
-          <w:color w:val="000000"/>
-          <w:sz w:val="26"/>
-          <w:szCs w:val="26"/>
-          <w:lang w:val="vi-VN"/>
-        </w:rPr>
-        <w:t>3</w:t>
-      </w:r>
-      <w:r>
-        <w:rPr>
-          <w:bCs/>
-          <w:color w:val="000000"/>
-          <w:sz w:val="26"/>
-          <w:szCs w:val="26"/>
-        </w:rPr>
-        <w:t>/202</w:t>
-      </w:r>
-      <w:r>
-        <w:rPr>
-          <w:bCs/>
-          <w:color w:val="000000"/>
-          <w:sz w:val="26"/>
-          <w:szCs w:val="26"/>
-          <w:lang w:val="vi-VN"/>
-        </w:rPr>
-        <w:t>6</w:t>
-      </w:r>
+          <w:lang w:val="en-US"/>
+        </w:rPr>
+      </w:pPr>
     </w:p>
     <w:p>
       <w:pPr>
@@ -1150,7 +1167,7 @@
           <w:tab w:val="left" w:pos="567"/>
         </w:tabs>
         <w:spacing w:before="120"/>
-        <w:ind w:left="2841" w:right="2696"/>
+        <w:ind w:left="2841" w:right="2600"/>
         <w:jc w:val="center"/>
         <w:rPr>
           <w:b/>
@@ -1461,6 +1478,18 @@
       <w:bookmarkStart w:id="9" w:name="_Toc224887758"/>
       <w:bookmarkStart w:id="10" w:name="_Toc224990107"/>
       <w:bookmarkStart w:id="11" w:name="_Toc224990295"/>
+    </w:p>
+    <w:p>
+      <w:pPr>
+        <w:jc w:val="center"/>
+        <w:rPr>
+          <w:b/>
+          <w:bCs/>
+          <w:sz w:val="28"/>
+          <w:szCs w:val="28"/>
+          <w:lang w:val="en-US"/>
+        </w:rPr>
+      </w:pPr>
     </w:p>
     <w:p>
       <w:pPr>
@@ -3863,7 +3892,7 @@
                 <w:noProof/>
                 <w:webHidden/>
               </w:rPr>
-              <w:t>3</w:t>
+              <w:t>4</w:t>
             </w:r>
             <w:r>
               <w:rPr>
@@ -4091,7 +4120,7 @@
                 <w:noProof/>
                 <w:webHidden/>
               </w:rPr>
-              <w:t>4</w:t>
+              <w:t>5</w:t>
             </w:r>
             <w:r>
               <w:rPr>
@@ -4547,7 +4576,7 @@
                 <w:noProof/>
                 <w:webHidden/>
               </w:rPr>
-              <w:t>7</w:t>
+              <w:t>8</w:t>
             </w:r>
             <w:r>
               <w:rPr>
@@ -4775,7 +4804,7 @@
                 <w:noProof/>
                 <w:webHidden/>
               </w:rPr>
-              <w:t>8</w:t>
+              <w:t>9</w:t>
             </w:r>
             <w:r>
               <w:rPr>
@@ -4851,7 +4880,7 @@
                 <w:noProof/>
                 <w:webHidden/>
               </w:rPr>
-              <w:t>8</w:t>
+              <w:t>9</w:t>
             </w:r>
             <w:r>
               <w:rPr>
@@ -5231,7 +5260,7 @@
                 <w:noProof/>
                 <w:webHidden/>
               </w:rPr>
-              <w:t>9</w:t>
+              <w:t>10</w:t>
             </w:r>
             <w:r>
               <w:rPr>
@@ -5611,7 +5640,7 @@
                 <w:noProof/>
                 <w:webHidden/>
               </w:rPr>
-              <w:t>10</w:t>
+              <w:t>11</w:t>
             </w:r>
             <w:r>
               <w:rPr>
@@ -5991,7 +6020,7 @@
                 <w:noProof/>
                 <w:webHidden/>
               </w:rPr>
-              <w:t>11</w:t>
+              <w:t>12</w:t>
             </w:r>
             <w:r>
               <w:rPr>
@@ -6067,7 +6096,7 @@
                 <w:noProof/>
                 <w:webHidden/>
               </w:rPr>
-              <w:t>11</w:t>
+              <w:t>12</w:t>
             </w:r>
             <w:r>
               <w:rPr>
@@ -6371,7 +6400,7 @@
                 <w:noProof/>
                 <w:webHidden/>
               </w:rPr>
-              <w:t>12</w:t>
+              <w:t>13</w:t>
             </w:r>
             <w:r>
               <w:rPr>
@@ -6447,7 +6476,7 @@
                 <w:noProof/>
                 <w:webHidden/>
               </w:rPr>
-              <w:t>12</w:t>
+              <w:t>13</w:t>
             </w:r>
             <w:r>
               <w:rPr>
@@ -6675,7 +6704,7 @@
                 <w:noProof/>
                 <w:webHidden/>
               </w:rPr>
-              <w:t>13</w:t>
+              <w:t>14</w:t>
             </w:r>
             <w:r>
               <w:rPr>
@@ -6751,7 +6780,7 @@
                 <w:noProof/>
                 <w:webHidden/>
               </w:rPr>
-              <w:t>13</w:t>
+              <w:t>14</w:t>
             </w:r>
             <w:r>
               <w:rPr>
@@ -6827,7 +6856,7 @@
                 <w:noProof/>
                 <w:webHidden/>
               </w:rPr>
-              <w:t>13</w:t>
+              <w:t>14</w:t>
             </w:r>
             <w:r>
               <w:rPr>
@@ -7359,7 +7388,7 @@
                 <w:noProof/>
                 <w:webHidden/>
               </w:rPr>
-              <w:t>14</w:t>
+              <w:t>15</w:t>
             </w:r>
             <w:r>
               <w:rPr>
@@ -7435,7 +7464,7 @@
                 <w:noProof/>
                 <w:webHidden/>
               </w:rPr>
-              <w:t>14</w:t>
+              <w:t>15</w:t>
             </w:r>
             <w:r>
               <w:rPr>
@@ -7511,7 +7540,7 @@
                 <w:noProof/>
                 <w:webHidden/>
               </w:rPr>
-              <w:t>14</w:t>
+              <w:t>15</w:t>
             </w:r>
             <w:r>
               <w:rPr>
@@ -7815,7 +7844,7 @@
                 <w:noProof/>
                 <w:webHidden/>
               </w:rPr>
-              <w:t>15</w:t>
+              <w:t>16</w:t>
             </w:r>
             <w:r>
               <w:rPr>
@@ -7891,7 +7920,7 @@
                 <w:noProof/>
                 <w:webHidden/>
               </w:rPr>
-              <w:t>16</w:t>
+              <w:t>17</w:t>
             </w:r>
             <w:r>
               <w:rPr>
@@ -7967,7 +7996,7 @@
                 <w:noProof/>
                 <w:webHidden/>
               </w:rPr>
-              <w:t>17</w:t>
+              <w:t>18</w:t>
             </w:r>
             <w:r>
               <w:rPr>
@@ -8043,7 +8072,7 @@
                 <w:noProof/>
                 <w:webHidden/>
               </w:rPr>
-              <w:t>17</w:t>
+              <w:t>18</w:t>
             </w:r>
             <w:r>
               <w:rPr>
@@ -8119,7 +8148,7 @@
                 <w:noProof/>
                 <w:webHidden/>
               </w:rPr>
-              <w:t>17</w:t>
+              <w:t>18</w:t>
             </w:r>
             <w:r>
               <w:rPr>
@@ -8195,7 +8224,7 @@
                 <w:noProof/>
                 <w:webHidden/>
               </w:rPr>
-              <w:t>17</w:t>
+              <w:t>18</w:t>
             </w:r>
             <w:r>
               <w:rPr>
@@ -8271,7 +8300,7 @@
                 <w:noProof/>
                 <w:webHidden/>
               </w:rPr>
-              <w:t>17</w:t>
+              <w:t>18</w:t>
             </w:r>
             <w:r>
               <w:rPr>
@@ -8347,7 +8376,7 @@
                 <w:noProof/>
                 <w:webHidden/>
               </w:rPr>
-              <w:t>18</w:t>
+              <w:t>19</w:t>
             </w:r>
             <w:r>
               <w:rPr>
@@ -8423,7 +8452,7 @@
                 <w:noProof/>
                 <w:webHidden/>
               </w:rPr>
-              <w:t>18</w:t>
+              <w:t>19</w:t>
             </w:r>
             <w:r>
               <w:rPr>
@@ -8499,7 +8528,7 @@
                 <w:noProof/>
                 <w:webHidden/>
               </w:rPr>
-              <w:t>18</w:t>
+              <w:t>19</w:t>
             </w:r>
             <w:r>
               <w:rPr>
@@ -8575,7 +8604,7 @@
                 <w:noProof/>
                 <w:webHidden/>
               </w:rPr>
-              <w:t>18</w:t>
+              <w:t>19</w:t>
             </w:r>
             <w:r>
               <w:rPr>
@@ -8651,7 +8680,7 @@
                 <w:noProof/>
                 <w:webHidden/>
               </w:rPr>
-              <w:t>19</w:t>
+              <w:t>20</w:t>
             </w:r>
             <w:r>
               <w:rPr>
@@ -8727,7 +8756,7 @@
                 <w:noProof/>
                 <w:webHidden/>
               </w:rPr>
-              <w:t>19</w:t>
+              <w:t>20</w:t>
             </w:r>
             <w:r>
               <w:rPr>
@@ -8803,7 +8832,7 @@
                 <w:noProof/>
                 <w:webHidden/>
               </w:rPr>
-              <w:t>19</w:t>
+              <w:t>20</w:t>
             </w:r>
             <w:r>
               <w:rPr>
@@ -8879,7 +8908,7 @@
                 <w:noProof/>
                 <w:webHidden/>
               </w:rPr>
-              <w:t>19</w:t>
+              <w:t>21</w:t>
             </w:r>
             <w:r>
               <w:rPr>
@@ -8955,7 +8984,7 @@
                 <w:noProof/>
                 <w:webHidden/>
               </w:rPr>
-              <w:t>20</w:t>
+              <w:t>21</w:t>
             </w:r>
             <w:r>
               <w:rPr>
@@ -9031,7 +9060,7 @@
                 <w:noProof/>
                 <w:webHidden/>
               </w:rPr>
-              <w:t>20</w:t>
+              <w:t>21</w:t>
             </w:r>
             <w:r>
               <w:rPr>
@@ -9107,7 +9136,7 @@
                 <w:noProof/>
                 <w:webHidden/>
               </w:rPr>
-              <w:t>21</w:t>
+              <w:t>22</w:t>
             </w:r>
             <w:r>
               <w:rPr>
@@ -9183,7 +9212,7 @@
                 <w:noProof/>
                 <w:webHidden/>
               </w:rPr>
-              <w:t>21</w:t>
+              <w:t>23</w:t>
             </w:r>
             <w:r>
               <w:rPr>
@@ -9259,7 +9288,7 @@
                 <w:noProof/>
                 <w:webHidden/>
               </w:rPr>
-              <w:t>23</w:t>
+              <w:t>24</w:t>
             </w:r>
             <w:r>
               <w:rPr>
@@ -9335,7 +9364,7 @@
                 <w:noProof/>
                 <w:webHidden/>
               </w:rPr>
-              <w:t>23</w:t>
+              <w:t>24</w:t>
             </w:r>
             <w:r>
               <w:rPr>
@@ -9411,7 +9440,7 @@
                 <w:noProof/>
                 <w:webHidden/>
               </w:rPr>
-              <w:t>24</w:t>
+              <w:t>25</w:t>
             </w:r>
             <w:r>
               <w:rPr>
@@ -9487,7 +9516,7 @@
                 <w:noProof/>
                 <w:webHidden/>
               </w:rPr>
-              <w:t>25</w:t>
+              <w:t>26</w:t>
             </w:r>
             <w:r>
               <w:rPr>
@@ -9563,7 +9592,7 @@
                 <w:noProof/>
                 <w:webHidden/>
               </w:rPr>
-              <w:t>26</w:t>
+              <w:t>27</w:t>
             </w:r>
             <w:r>
               <w:rPr>
@@ -9639,7 +9668,7 @@
                 <w:noProof/>
                 <w:webHidden/>
               </w:rPr>
-              <w:t>26</w:t>
+              <w:t>27</w:t>
             </w:r>
             <w:r>
               <w:rPr>
@@ -9714,7 +9743,7 @@
                 <w:noProof/>
                 <w:webHidden/>
               </w:rPr>
-              <w:t>27</w:t>
+              <w:t>28</w:t>
             </w:r>
             <w:r>
               <w:rPr>
@@ -9789,7 +9818,7 @@
                 <w:noProof/>
                 <w:webHidden/>
               </w:rPr>
-              <w:t>27</w:t>
+              <w:t>28</w:t>
             </w:r>
             <w:r>
               <w:rPr>
@@ -9864,7 +9893,7 @@
                 <w:noProof/>
                 <w:webHidden/>
               </w:rPr>
-              <w:t>27</w:t>
+              <w:t>28</w:t>
             </w:r>
             <w:r>
               <w:rPr>
@@ -9939,7 +9968,7 @@
                 <w:noProof/>
                 <w:webHidden/>
               </w:rPr>
-              <w:t>27</w:t>
+              <w:t>28</w:t>
             </w:r>
             <w:r>
               <w:rPr>
@@ -10015,7 +10044,7 @@
                 <w:noProof/>
                 <w:webHidden/>
               </w:rPr>
-              <w:t>28</w:t>
+              <w:t>29</w:t>
             </w:r>
             <w:r>
               <w:rPr>
@@ -10091,7 +10120,7 @@
                 <w:noProof/>
                 <w:webHidden/>
               </w:rPr>
-              <w:t>29</w:t>
+              <w:t>30</w:t>
             </w:r>
             <w:r>
               <w:rPr>
@@ -10167,7 +10196,7 @@
                 <w:noProof/>
                 <w:webHidden/>
               </w:rPr>
-              <w:t>29</w:t>
+              <w:t>30</w:t>
             </w:r>
             <w:r>
               <w:rPr>
@@ -10243,7 +10272,7 @@
                 <w:noProof/>
                 <w:webHidden/>
               </w:rPr>
-              <w:t>29</w:t>
+              <w:t>30</w:t>
             </w:r>
             <w:r>
               <w:rPr>
@@ -10319,7 +10348,7 @@
                 <w:noProof/>
                 <w:webHidden/>
               </w:rPr>
-              <w:t>29</w:t>
+              <w:t>30</w:t>
             </w:r>
             <w:r>
               <w:rPr>
@@ -10395,7 +10424,7 @@
                 <w:noProof/>
                 <w:webHidden/>
               </w:rPr>
-              <w:t>30</w:t>
+              <w:t>31</w:t>
             </w:r>
             <w:r>
               <w:rPr>
@@ -10471,7 +10500,7 @@
                 <w:noProof/>
                 <w:webHidden/>
               </w:rPr>
-              <w:t>30</w:t>
+              <w:t>31</w:t>
             </w:r>
             <w:r>
               <w:rPr>
@@ -10547,7 +10576,7 @@
                 <w:noProof/>
                 <w:webHidden/>
               </w:rPr>
-              <w:t>30</w:t>
+              <w:t>31</w:t>
             </w:r>
             <w:r>
               <w:rPr>
@@ -10623,7 +10652,7 @@
                 <w:noProof/>
                 <w:webHidden/>
               </w:rPr>
-              <w:t>30</w:t>
+              <w:t>31</w:t>
             </w:r>
             <w:r>
               <w:rPr>
@@ -10699,7 +10728,7 @@
                 <w:noProof/>
                 <w:webHidden/>
               </w:rPr>
-              <w:t>31</w:t>
+              <w:t>32</w:t>
             </w:r>
             <w:r>
               <w:rPr>
@@ -10775,7 +10804,7 @@
                 <w:noProof/>
                 <w:webHidden/>
               </w:rPr>
-              <w:t>31</w:t>
+              <w:t>32</w:t>
             </w:r>
             <w:r>
               <w:rPr>
@@ -10851,7 +10880,7 @@
                 <w:noProof/>
                 <w:webHidden/>
               </w:rPr>
-              <w:t>32</w:t>
+              <w:t>33</w:t>
             </w:r>
             <w:r>
               <w:rPr>
@@ -10927,7 +10956,7 @@
                 <w:noProof/>
                 <w:webHidden/>
               </w:rPr>
-              <w:t>32</w:t>
+              <w:t>33</w:t>
             </w:r>
             <w:r>
               <w:rPr>
@@ -11003,7 +11032,7 @@
                 <w:noProof/>
                 <w:webHidden/>
               </w:rPr>
-              <w:t>32</w:t>
+              <w:t>34</w:t>
             </w:r>
             <w:r>
               <w:rPr>
@@ -11079,7 +11108,7 @@
                 <w:noProof/>
                 <w:webHidden/>
               </w:rPr>
-              <w:t>33</w:t>
+              <w:t>34</w:t>
             </w:r>
             <w:r>
               <w:rPr>
@@ -11155,7 +11184,7 @@
                 <w:noProof/>
                 <w:webHidden/>
               </w:rPr>
-              <w:t>33</w:t>
+              <w:t>34</w:t>
             </w:r>
             <w:r>
               <w:rPr>
@@ -11231,7 +11260,7 @@
                 <w:noProof/>
                 <w:webHidden/>
               </w:rPr>
-              <w:t>33</w:t>
+              <w:t>34</w:t>
             </w:r>
             <w:r>
               <w:rPr>
@@ -11307,7 +11336,7 @@
                 <w:noProof/>
                 <w:webHidden/>
               </w:rPr>
-              <w:t>33</w:t>
+              <w:t>35</w:t>
             </w:r>
             <w:r>
               <w:rPr>
@@ -11383,7 +11412,7 @@
                 <w:noProof/>
                 <w:webHidden/>
               </w:rPr>
-              <w:t>34</w:t>
+              <w:t>35</w:t>
             </w:r>
             <w:r>
               <w:rPr>
@@ -11459,7 +11488,7 @@
                 <w:noProof/>
                 <w:webHidden/>
               </w:rPr>
-              <w:t>34</w:t>
+              <w:t>35</w:t>
             </w:r>
             <w:r>
               <w:rPr>
@@ -11535,7 +11564,7 @@
                 <w:noProof/>
                 <w:webHidden/>
               </w:rPr>
-              <w:t>34</w:t>
+              <w:t>35</w:t>
             </w:r>
             <w:r>
               <w:rPr>
@@ -11611,7 +11640,7 @@
                 <w:noProof/>
                 <w:webHidden/>
               </w:rPr>
-              <w:t>34</w:t>
+              <w:t>36</w:t>
             </w:r>
             <w:r>
               <w:rPr>
@@ -11687,7 +11716,7 @@
                 <w:noProof/>
                 <w:webHidden/>
               </w:rPr>
-              <w:t>35</w:t>
+              <w:t>36</w:t>
             </w:r>
             <w:r>
               <w:rPr>
@@ -11763,7 +11792,7 @@
                 <w:noProof/>
                 <w:webHidden/>
               </w:rPr>
-              <w:t>35</w:t>
+              <w:t>36</w:t>
             </w:r>
             <w:r>
               <w:rPr>
@@ -11839,7 +11868,7 @@
                 <w:noProof/>
                 <w:webHidden/>
               </w:rPr>
-              <w:t>35</w:t>
+              <w:t>36</w:t>
             </w:r>
             <w:r>
               <w:rPr>
@@ -11915,7 +11944,7 @@
                 <w:noProof/>
                 <w:webHidden/>
               </w:rPr>
-              <w:t>36</w:t>
+              <w:t>37</w:t>
             </w:r>
             <w:r>
               <w:rPr>
@@ -11991,7 +12020,7 @@
                 <w:noProof/>
                 <w:webHidden/>
               </w:rPr>
-              <w:t>36</w:t>
+              <w:t>37</w:t>
             </w:r>
             <w:r>
               <w:rPr>
@@ -12067,7 +12096,7 @@
                 <w:noProof/>
                 <w:webHidden/>
               </w:rPr>
-              <w:t>36</w:t>
+              <w:t>37</w:t>
             </w:r>
             <w:r>
               <w:rPr>
@@ -12143,7 +12172,7 @@
                 <w:noProof/>
                 <w:webHidden/>
               </w:rPr>
-              <w:t>37</w:t>
+              <w:t>38</w:t>
             </w:r>
             <w:r>
               <w:rPr>
@@ -12219,7 +12248,7 @@
                 <w:noProof/>
                 <w:webHidden/>
               </w:rPr>
-              <w:t>38</w:t>
+              <w:t>39</w:t>
             </w:r>
             <w:r>
               <w:rPr>
@@ -12295,7 +12324,7 @@
                 <w:noProof/>
                 <w:webHidden/>
               </w:rPr>
-              <w:t>38</w:t>
+              <w:t>40</w:t>
             </w:r>
             <w:r>
               <w:rPr>
@@ -12371,7 +12400,7 @@
                 <w:noProof/>
                 <w:webHidden/>
               </w:rPr>
-              <w:t>39</w:t>
+              <w:t>41</w:t>
             </w:r>
             <w:r>
               <w:rPr>
@@ -12447,7 +12476,7 @@
                 <w:noProof/>
                 <w:webHidden/>
               </w:rPr>
-              <w:t>39</w:t>
+              <w:t>41</w:t>
             </w:r>
             <w:r>
               <w:rPr>
@@ -12523,7 +12552,7 @@
                 <w:noProof/>
                 <w:webHidden/>
               </w:rPr>
-              <w:t>40</w:t>
+              <w:t>42</w:t>
             </w:r>
             <w:r>
               <w:rPr>
@@ -12599,7 +12628,7 @@
                 <w:noProof/>
                 <w:webHidden/>
               </w:rPr>
-              <w:t>40</w:t>
+              <w:t>42</w:t>
             </w:r>
             <w:r>
               <w:rPr>
@@ -12675,7 +12704,7 @@
                 <w:noProof/>
                 <w:webHidden/>
               </w:rPr>
-              <w:t>40</w:t>
+              <w:t>42</w:t>
             </w:r>
             <w:r>
               <w:rPr>
@@ -12751,7 +12780,7 @@
                 <w:noProof/>
                 <w:webHidden/>
               </w:rPr>
-              <w:t>41</w:t>
+              <w:t>43</w:t>
             </w:r>
             <w:r>
               <w:rPr>
@@ -12827,7 +12856,7 @@
                 <w:noProof/>
                 <w:webHidden/>
               </w:rPr>
-              <w:t>41</w:t>
+              <w:t>43</w:t>
             </w:r>
             <w:r>
               <w:rPr>
@@ -12903,7 +12932,7 @@
                 <w:noProof/>
                 <w:webHidden/>
               </w:rPr>
-              <w:t>41</w:t>
+              <w:t>43</w:t>
             </w:r>
             <w:r>
               <w:rPr>
@@ -12979,7 +13008,7 @@
                 <w:noProof/>
                 <w:webHidden/>
               </w:rPr>
-              <w:t>41</w:t>
+              <w:t>43</w:t>
             </w:r>
             <w:r>
               <w:rPr>
@@ -13055,7 +13084,7 @@
                 <w:noProof/>
                 <w:webHidden/>
               </w:rPr>
-              <w:t>41</w:t>
+              <w:t>43</w:t>
             </w:r>
             <w:r>
               <w:rPr>
@@ -13131,7 +13160,7 @@
                 <w:noProof/>
                 <w:webHidden/>
               </w:rPr>
-              <w:t>42</w:t>
+              <w:t>44</w:t>
             </w:r>
             <w:r>
               <w:rPr>
@@ -13207,7 +13236,7 @@
                 <w:noProof/>
                 <w:webHidden/>
               </w:rPr>
-              <w:t>42</w:t>
+              <w:t>44</w:t>
             </w:r>
             <w:r>
               <w:rPr>
@@ -13283,7 +13312,7 @@
                 <w:noProof/>
                 <w:webHidden/>
               </w:rPr>
-              <w:t>42</w:t>
+              <w:t>44</w:t>
             </w:r>
             <w:r>
               <w:rPr>
@@ -13359,7 +13388,7 @@
                 <w:noProof/>
                 <w:webHidden/>
               </w:rPr>
-              <w:t>42</w:t>
+              <w:t>44</w:t>
             </w:r>
             <w:r>
               <w:rPr>
@@ -13435,7 +13464,7 @@
                 <w:noProof/>
                 <w:webHidden/>
               </w:rPr>
-              <w:t>42</w:t>
+              <w:t>44</w:t>
             </w:r>
             <w:r>
               <w:rPr>
@@ -13511,7 +13540,7 @@
                 <w:noProof/>
                 <w:webHidden/>
               </w:rPr>
-              <w:t>42</w:t>
+              <w:t>44</w:t>
             </w:r>
             <w:r>
               <w:rPr>
@@ -13587,7 +13616,7 @@
                 <w:noProof/>
                 <w:webHidden/>
               </w:rPr>
-              <w:t>43</w:t>
+              <w:t>45</w:t>
             </w:r>
             <w:r>
               <w:rPr>
@@ -13663,7 +13692,7 @@
                 <w:noProof/>
                 <w:webHidden/>
               </w:rPr>
-              <w:t>43</w:t>
+              <w:t>45</w:t>
             </w:r>
             <w:r>
               <w:rPr>
@@ -13739,7 +13768,7 @@
                 <w:noProof/>
                 <w:webHidden/>
               </w:rPr>
-              <w:t>43</w:t>
+              <w:t>45</w:t>
             </w:r>
             <w:r>
               <w:rPr>
@@ -13815,7 +13844,7 @@
                 <w:noProof/>
                 <w:webHidden/>
               </w:rPr>
-              <w:t>43</w:t>
+              <w:t>45</w:t>
             </w:r>
             <w:r>
               <w:rPr>
@@ -13891,7 +13920,7 @@
                 <w:noProof/>
                 <w:webHidden/>
               </w:rPr>
-              <w:t>43</w:t>
+              <w:t>45</w:t>
             </w:r>
             <w:r>
               <w:rPr>
@@ -13967,7 +13996,7 @@
                 <w:noProof/>
                 <w:webHidden/>
               </w:rPr>
-              <w:t>43</w:t>
+              <w:t>45</w:t>
             </w:r>
             <w:r>
               <w:rPr>
@@ -14043,7 +14072,7 @@
                 <w:noProof/>
                 <w:webHidden/>
               </w:rPr>
-              <w:t>43</w:t>
+              <w:t>45</w:t>
             </w:r>
             <w:r>
               <w:rPr>
@@ -14119,7 +14148,7 @@
                 <w:noProof/>
                 <w:webHidden/>
               </w:rPr>
-              <w:t>44</w:t>
+              <w:t>46</w:t>
             </w:r>
             <w:r>
               <w:rPr>
@@ -14195,7 +14224,7 @@
                 <w:noProof/>
                 <w:webHidden/>
               </w:rPr>
-              <w:t>44</w:t>
+              <w:t>46</w:t>
             </w:r>
             <w:r>
               <w:rPr>
@@ -14271,7 +14300,7 @@
                 <w:noProof/>
                 <w:webHidden/>
               </w:rPr>
-              <w:t>44</w:t>
+              <w:t>46</w:t>
             </w:r>
             <w:r>
               <w:rPr>
@@ -14347,7 +14376,7 @@
                 <w:noProof/>
                 <w:webHidden/>
               </w:rPr>
-              <w:t>45</w:t>
+              <w:t>47</w:t>
             </w:r>
             <w:r>
               <w:rPr>
@@ -14423,7 +14452,7 @@
                 <w:noProof/>
                 <w:webHidden/>
               </w:rPr>
-              <w:t>45</w:t>
+              <w:t>47</w:t>
             </w:r>
             <w:r>
               <w:rPr>
@@ -14499,7 +14528,7 @@
                 <w:noProof/>
                 <w:webHidden/>
               </w:rPr>
-              <w:t>46</w:t>
+              <w:t>48</w:t>
             </w:r>
             <w:r>
               <w:rPr>
@@ -14574,7 +14603,7 @@
                 <w:noProof/>
                 <w:webHidden/>
               </w:rPr>
-              <w:t>48</w:t>
+              <w:t>50</w:t>
             </w:r>
             <w:r>
               <w:rPr>
@@ -17213,6 +17242,32 @@
     </w:p>
     <w:p>
       <w:pPr>
+        <w:tabs>
+          <w:tab w:val="left" w:pos="567"/>
+        </w:tabs>
+        <w:spacing w:before="120"/>
+        <w:rPr>
+          <w:sz w:val="26"/>
+          <w:szCs w:val="26"/>
+          <w:lang w:val="en-US"/>
+        </w:rPr>
+      </w:pPr>
+    </w:p>
+    <w:p>
+      <w:pPr>
+        <w:tabs>
+          <w:tab w:val="left" w:pos="567"/>
+        </w:tabs>
+        <w:spacing w:before="120"/>
+        <w:rPr>
+          <w:sz w:val="26"/>
+          <w:szCs w:val="26"/>
+          <w:lang w:val="en-US"/>
+        </w:rPr>
+      </w:pPr>
+    </w:p>
+    <w:p>
+      <w:pPr>
         <w:pStyle w:val="Heading2"/>
         <w:rPr>
           <w:rFonts w:ascii="Times New Roman" w:hAnsi="Times New Roman" w:cs="Times New Roman"/>
@@ -17233,6 +17288,7 @@
           <w:szCs w:val="28"/>
           <w:lang w:val="en-US"/>
         </w:rPr>
+        <w:lastRenderedPageBreak/>
         <w:t>1.5. Phương pháp nghiên cứu</w:t>
       </w:r>
       <w:bookmarkEnd w:id="24"/>
@@ -17284,7 +17340,6 @@
           <w:szCs w:val="26"/>
           <w:lang w:val="en-US"/>
         </w:rPr>
-        <w:lastRenderedPageBreak/>
         <w:t>a) Phương pháp nghiên cứu lý thuyết</w:t>
       </w:r>
     </w:p>
@@ -17592,6 +17647,19 @@
     </w:p>
     <w:p>
       <w:pPr>
+        <w:tabs>
+          <w:tab w:val="left" w:pos="567"/>
+        </w:tabs>
+        <w:spacing w:before="120"/>
+        <w:rPr>
+          <w:sz w:val="26"/>
+          <w:szCs w:val="26"/>
+          <w:lang w:val="en-US"/>
+        </w:rPr>
+      </w:pPr>
+    </w:p>
+    <w:p>
+      <w:pPr>
         <w:pStyle w:val="Heading3"/>
         <w:rPr>
           <w:b/>
@@ -17608,6 +17676,7 @@
           <w:color w:val="auto"/>
           <w:lang w:val="en-US"/>
         </w:rPr>
+        <w:lastRenderedPageBreak/>
         <w:t>1.6.2. Ý nghĩa thực tiễn</w:t>
       </w:r>
       <w:bookmarkEnd w:id="27"/>
@@ -17659,7 +17728,6 @@
           <w:szCs w:val="26"/>
           <w:lang w:val="en-US"/>
         </w:rPr>
-        <w:lastRenderedPageBreak/>
         <w:tab/>
       </w:r>
       <w:r>
@@ -18086,7 +18154,16 @@
           <w:szCs w:val="26"/>
           <w:lang w:val="en-US"/>
         </w:rPr>
-        <w:t>Trong các ứng dụng nêu trên, bài toán tóm tắt văn bản là một hướng nghiên cứu có tính ứng dụng cao, bởi nó giúp người dùng nhanh chóng nắm bắt nội dung quan trọng của tài liệu mà không cần đọc toàn bộ văn bản. Để xây dựng được một hệ thống tóm tắt văn bản, cần có nền tảng kiến thức về xử lý ngôn ngữ tự nhiên như tiền xử lý dữ liệu, phân tích câu, đánh giá mức độ quan trọng của thông tin và tổ chức đầu ra phù hợp.</w:t>
+        <w:t xml:space="preserve">Trong các ứng dụng nêu trên, bài toán tóm tắt văn bản là một hướng nghiên cứu </w:t>
+      </w:r>
+      <w:r>
+        <w:rPr>
+          <w:sz w:val="26"/>
+          <w:szCs w:val="26"/>
+          <w:lang w:val="en-US"/>
+        </w:rPr>
+        <w:lastRenderedPageBreak/>
+        <w:t>có tính ứng dụng cao, bởi nó giúp người dùng nhanh chóng nắm bắt nội dung quan trọng của tài liệu mà không cần đọc toàn bộ văn bản. Để xây dựng được một hệ thống tóm tắt văn bản, cần có nền tảng kiến thức về xử lý ngôn ngữ tự nhiên như tiền xử lý dữ liệu, phân tích câu, đánh giá mức độ quan trọng của thông tin và tổ chức đầu ra phù hợp.</w:t>
       </w:r>
     </w:p>
     <w:p>
@@ -18115,16 +18192,7 @@
           <w:szCs w:val="26"/>
           <w:lang w:val="en-US"/>
         </w:rPr>
-        <w:t xml:space="preserve">Đối với tiếng Việt, việc xử lý ngôn ngữ tự nhiên còn gặp thêm nhiều khó khăn do </w:t>
-      </w:r>
-      <w:r>
-        <w:rPr>
-          <w:sz w:val="26"/>
-          <w:szCs w:val="26"/>
-          <w:lang w:val="en-US"/>
-        </w:rPr>
-        <w:lastRenderedPageBreak/>
-        <w:t>đặc điểm ngôn ngữ như từ ghép, dấu câu, cách biểu đạt linh hoạt và tính phụ thuộc ngữ cảnh cao. Vì vậy, việc nghiên cứu và xây dựng các hệ thống xử lý văn bản tiếng Việt nói chung, cũng như hệ thống tóm tắt văn bản nói riêng, có ý nghĩa quan trọng cả về mặt học thuật lẫn thực tiễn.</w:t>
+        <w:t>Đối với tiếng Việt, việc xử lý ngôn ngữ tự nhiên còn gặp thêm nhiều khó khăn do đặc điểm ngôn ngữ như từ ghép, dấu câu, cách biểu đạt linh hoạt và tính phụ thuộc ngữ cảnh cao. Vì vậy, việc nghiên cứu và xây dựng các hệ thống xử lý văn bản tiếng Việt nói chung, cũng như hệ thống tóm tắt văn bản nói riêng, có ý nghĩa quan trọng cả về mặt học thuật lẫn thực tiễn.</w:t>
       </w:r>
     </w:p>
     <w:p>
@@ -18458,6 +18526,7 @@
           <w:szCs w:val="26"/>
           <w:lang w:val="en-US"/>
         </w:rPr>
+        <w:lastRenderedPageBreak/>
         <w:t>Tóm tắt tin tức để người đọc nắm nhanh nội dung.</w:t>
       </w:r>
     </w:p>
@@ -18574,7 +18643,6 @@
           <w:szCs w:val="26"/>
           <w:lang w:val="en-US"/>
         </w:rPr>
-        <w:lastRenderedPageBreak/>
         <w:t>Hỗ trợ người dùng đọc nhanh nội dung trên web hoặc ứng dụng.</w:t>
       </w:r>
     </w:p>
@@ -18982,6 +19050,7 @@
           <w:color w:val="auto"/>
           <w:lang w:val="en-US"/>
         </w:rPr>
+        <w:lastRenderedPageBreak/>
         <w:t>2.3.2. Phương pháp tóm tắt sinh diễn giải</w:t>
       </w:r>
       <w:bookmarkEnd w:id="33"/>
@@ -19041,16 +19110,7 @@
           <w:szCs w:val="26"/>
           <w:lang w:val="en-US"/>
         </w:rPr>
-        <w:t xml:space="preserve">Phương pháp tóm tắt sinh diễn giải thường dựa trên các mô hình học máy hoặc </w:t>
-      </w:r>
-      <w:r>
-        <w:rPr>
-          <w:sz w:val="26"/>
-          <w:szCs w:val="26"/>
-          <w:lang w:val="en-US"/>
-        </w:rPr>
-        <w:lastRenderedPageBreak/>
-        <w:t>học sâu, đặc biệt là các mô hình ngôn ngữ hiện đại. Hệ thống sẽ học cách biểu diễn nội dung văn bản đầu vào và sau đó sinh ra đoạn tóm tắt phù hợp.</w:t>
+        <w:t>Phương pháp tóm tắt sinh diễn giải thường dựa trên các mô hình học máy hoặc học sâu, đặc biệt là các mô hình ngôn ngữ hiện đại. Hệ thống sẽ học cách biểu diễn nội dung văn bản đầu vào và sau đó sinh ra đoạn tóm tắt phù hợp.</w:t>
       </w:r>
     </w:p>
     <w:p>
@@ -19385,6 +19445,7 @@
           <w:color w:val="auto"/>
           <w:lang w:val="en-US"/>
         </w:rPr>
+        <w:lastRenderedPageBreak/>
         <w:t>2.4.1. Thu thập hoặc nhập dữ liệu đầu vào</w:t>
       </w:r>
       <w:bookmarkEnd w:id="36"/>
@@ -19466,16 +19527,7 @@
           <w:szCs w:val="26"/>
           <w:lang w:val="en-US"/>
         </w:rPr>
-        <w:t xml:space="preserve">Văn bản đầu vào thường chứa các thành phần không cần thiết như ký tự đặc biệt, </w:t>
-      </w:r>
-      <w:r>
-        <w:rPr>
-          <w:sz w:val="26"/>
-          <w:szCs w:val="26"/>
-          <w:lang w:val="en-US"/>
-        </w:rPr>
-        <w:lastRenderedPageBreak/>
-        <w:t>khoảng trắng dư thừa, dấu câu không phù hợp hoặc các ký hiệu gây nhiễu. Vì vậy, cần thực hiện bước làm sạch dữ liệu để loại bỏ các thành phần này, giúp văn bản trở nên chuẩn hơn cho các bước xử lý tiếp theo.</w:t>
+        <w:t>Văn bản đầu vào thường chứa các thành phần không cần thiết như ký tự đặc biệt, khoảng trắng dư thừa, dấu câu không phù hợp hoặc các ký hiệu gây nhiễu. Vì vậy, cần thực hiện bước làm sạch dữ liệu để loại bỏ các thành phần này, giúp văn bản trở nên chuẩn hơn cho các bước xử lý tiếp theo.</w:t>
       </w:r>
     </w:p>
     <w:p>
@@ -19879,6 +19931,7 @@
           <w:szCs w:val="26"/>
           <w:lang w:val="en-US"/>
         </w:rPr>
+        <w:lastRenderedPageBreak/>
         <w:t>Vị trí câu trong văn bản.</w:t>
       </w:r>
     </w:p>
@@ -19976,7 +20029,6 @@
           <w:szCs w:val="26"/>
           <w:lang w:val="en-US"/>
         </w:rPr>
-        <w:lastRenderedPageBreak/>
         <w:tab/>
       </w:r>
       <w:r>
@@ -20338,6 +20390,7 @@
           <w:szCs w:val="26"/>
           <w:lang w:val="en-US"/>
         </w:rPr>
+        <w:lastRenderedPageBreak/>
         <w:tab/>
       </w:r>
       <w:r>
@@ -20447,7 +20500,6 @@
           <w:szCs w:val="26"/>
           <w:lang w:val="en-US"/>
         </w:rPr>
-        <w:lastRenderedPageBreak/>
         <w:t>Độ dài của câu.</w:t>
       </w:r>
     </w:p>
@@ -20828,6 +20880,7 @@
           <w:color w:val="auto"/>
           <w:lang w:val="en-US"/>
         </w:rPr>
+        <w:lastRenderedPageBreak/>
         <w:t>2.6.2. Thư viện hỗ trợ xử lý văn bản</w:t>
       </w:r>
       <w:bookmarkEnd w:id="52"/>
@@ -20925,16 +20978,7 @@
           <w:szCs w:val="26"/>
           <w:lang w:val="en-US"/>
         </w:rPr>
-        <w:t xml:space="preserve">Đề tài sử dụng tệp cấu hình thư viện để quản lý các gói cần thiết cho hệ thống. Việc quản lý phụ thuộc giúp bảo đảm môi trường chạy ổn định, đồng thời tạo điều kiện </w:t>
-      </w:r>
-      <w:r>
-        <w:rPr>
-          <w:sz w:val="26"/>
-          <w:szCs w:val="26"/>
-          <w:lang w:val="en-US"/>
-        </w:rPr>
-        <w:lastRenderedPageBreak/>
-        <w:t>thuận lợi cho việc cài đặt lại hệ thống trên máy khác.</w:t>
+        <w:t>Đề tài sử dụng tệp cấu hình thư viện để quản lý các gói cần thiết cho hệ thống. Việc quản lý phụ thuộc giúp bảo đảm môi trường chạy ổn định, đồng thời tạo điều kiện thuận lợi cho việc cài đặt lại hệ thống trên máy khác.</w:t>
       </w:r>
     </w:p>
     <w:p>
@@ -21198,6 +21242,7 @@
           <w:szCs w:val="32"/>
           <w:lang w:val="en-US"/>
         </w:rPr>
+        <w:lastRenderedPageBreak/>
         <w:t>CHƯƠNG 3. PHÂN TÍCH VÀ THIẾT KẾ HỆ THỐNG</w:t>
       </w:r>
       <w:bookmarkEnd w:id="57"/>
@@ -21283,16 +21328,7 @@
           <w:szCs w:val="26"/>
           <w:lang w:val="en-US"/>
         </w:rPr>
-        <w:t xml:space="preserve">Bài toán đặt ra đối với đề tài là xây dựng một hệ thống cho phép người dùng nhập </w:t>
-      </w:r>
-      <w:r>
-        <w:rPr>
-          <w:sz w:val="26"/>
-          <w:szCs w:val="26"/>
-          <w:lang w:val="en-US"/>
-        </w:rPr>
-        <w:lastRenderedPageBreak/>
-        <w:t>vào một đoạn văn bản, sau đó hệ thống thực hiện xử lý và đưa ra một bản tóm tắt ngắn gọn hơn nhưng vẫn giữ được những ý chính quan trọng của nội dung gốc. Hệ thống cần có cách tổ chức rõ ràng, dễ sử dụng và phù hợp với phạm vi của một đồ án công nghệ thông tin.</w:t>
+        <w:t>Bài toán đặt ra đối với đề tài là xây dựng một hệ thống cho phép người dùng nhập vào một đoạn văn bản, sau đó hệ thống thực hiện xử lý và đưa ra một bản tóm tắt ngắn gọn hơn nhưng vẫn giữ được những ý chính quan trọng của nội dung gốc. Hệ thống cần có cách tổ chức rõ ràng, dễ sử dụng và phù hợp với phạm vi của một đồ án công nghệ thông tin.</w:t>
       </w:r>
     </w:p>
     <w:p>
@@ -21625,6 +21661,19 @@
     </w:p>
     <w:p>
       <w:pPr>
+        <w:tabs>
+          <w:tab w:val="left" w:pos="567"/>
+        </w:tabs>
+        <w:spacing w:before="120"/>
+        <w:rPr>
+          <w:sz w:val="26"/>
+          <w:szCs w:val="26"/>
+          <w:lang w:val="en-US"/>
+        </w:rPr>
+      </w:pPr>
+    </w:p>
+    <w:p>
+      <w:pPr>
         <w:pStyle w:val="Heading3"/>
         <w:rPr>
           <w:b/>
@@ -21641,6 +21690,7 @@
           <w:color w:val="auto"/>
           <w:lang w:val="en-US"/>
         </w:rPr>
+        <w:lastRenderedPageBreak/>
         <w:t>3.2.2. Chức năng kiểm tra dữ liệu đầu vào</w:t>
       </w:r>
       <w:bookmarkEnd w:id="61"/>
@@ -21794,7 +21844,6 @@
           <w:color w:val="auto"/>
           <w:lang w:val="en-US"/>
         </w:rPr>
-        <w:lastRenderedPageBreak/>
         <w:t>3.2.5. Chức năng hiển thị kết quả</w:t>
       </w:r>
       <w:bookmarkEnd w:id="64"/>
@@ -22150,6 +22199,7 @@
           <w:color w:val="auto"/>
           <w:lang w:val="en-US"/>
         </w:rPr>
+        <w:lastRenderedPageBreak/>
         <w:t>3.3.4. Tính chính xác tương đối</w:t>
       </w:r>
       <w:bookmarkEnd w:id="70"/>
@@ -22311,16 +22361,7 @@
           <w:szCs w:val="26"/>
           <w:lang w:val="en-US"/>
         </w:rPr>
-        <w:t xml:space="preserve">Các yêu cầu phi chức năng này góp phần bảo đảm rằng hệ thống không chỉ hoạt </w:t>
-      </w:r>
-      <w:r>
-        <w:rPr>
-          <w:sz w:val="26"/>
-          <w:szCs w:val="26"/>
-          <w:lang w:val="en-US"/>
-        </w:rPr>
-        <w:lastRenderedPageBreak/>
-        <w:t>động đúng chức năng mà còn đáp ứng được các tiêu chí về chất lượng phần mềm.</w:t>
+        <w:t>Các yêu cầu phi chức năng này góp phần bảo đảm rằng hệ thống không chỉ hoạt động đúng chức năng mà còn đáp ứng được các tiêu chí về chất lượng phần mềm.</w:t>
       </w:r>
     </w:p>
     <w:p>
@@ -22601,6 +22642,71 @@
     </w:p>
     <w:p>
       <w:pPr>
+        <w:tabs>
+          <w:tab w:val="left" w:pos="567"/>
+        </w:tabs>
+        <w:spacing w:before="120"/>
+        <w:rPr>
+          <w:sz w:val="26"/>
+          <w:szCs w:val="26"/>
+          <w:lang w:val="en-US"/>
+        </w:rPr>
+      </w:pPr>
+    </w:p>
+    <w:p>
+      <w:pPr>
+        <w:tabs>
+          <w:tab w:val="left" w:pos="567"/>
+        </w:tabs>
+        <w:spacing w:before="120"/>
+        <w:rPr>
+          <w:sz w:val="26"/>
+          <w:szCs w:val="26"/>
+          <w:lang w:val="en-US"/>
+        </w:rPr>
+      </w:pPr>
+    </w:p>
+    <w:p>
+      <w:pPr>
+        <w:tabs>
+          <w:tab w:val="left" w:pos="567"/>
+        </w:tabs>
+        <w:spacing w:before="120"/>
+        <w:rPr>
+          <w:sz w:val="26"/>
+          <w:szCs w:val="26"/>
+          <w:lang w:val="en-US"/>
+        </w:rPr>
+      </w:pPr>
+    </w:p>
+    <w:p>
+      <w:pPr>
+        <w:tabs>
+          <w:tab w:val="left" w:pos="567"/>
+        </w:tabs>
+        <w:spacing w:before="120"/>
+        <w:rPr>
+          <w:sz w:val="26"/>
+          <w:szCs w:val="26"/>
+          <w:lang w:val="en-US"/>
+        </w:rPr>
+      </w:pPr>
+    </w:p>
+    <w:p>
+      <w:pPr>
+        <w:tabs>
+          <w:tab w:val="left" w:pos="567"/>
+        </w:tabs>
+        <w:spacing w:before="120"/>
+        <w:rPr>
+          <w:sz w:val="26"/>
+          <w:szCs w:val="26"/>
+          <w:lang w:val="en-US"/>
+        </w:rPr>
+      </w:pPr>
+    </w:p>
+    <w:p>
+      <w:pPr>
         <w:pStyle w:val="Heading3"/>
         <w:rPr>
           <w:b/>
@@ -22617,6 +22723,7 @@
           <w:color w:val="auto"/>
           <w:lang w:val="en-US"/>
         </w:rPr>
+        <w:lastRenderedPageBreak/>
         <w:t>3.4.3. Biểu đồ Use Case</w:t>
       </w:r>
       <w:bookmarkEnd w:id="76"/>
@@ -24794,6 +24901,19 @@
     </w:p>
     <w:p>
       <w:pPr>
+        <w:tabs>
+          <w:tab w:val="left" w:pos="567"/>
+        </w:tabs>
+        <w:spacing w:before="120"/>
+        <w:rPr>
+          <w:sz w:val="26"/>
+          <w:szCs w:val="26"/>
+          <w:lang w:val="en-US"/>
+        </w:rPr>
+      </w:pPr>
+    </w:p>
+    <w:p>
+      <w:pPr>
         <w:pStyle w:val="Heading2"/>
         <w:rPr>
           <w:rFonts w:ascii="Times New Roman" w:hAnsi="Times New Roman" w:cs="Times New Roman"/>
@@ -24814,6 +24934,7 @@
           <w:szCs w:val="28"/>
           <w:lang w:val="en-US"/>
         </w:rPr>
+        <w:lastRenderedPageBreak/>
         <w:t>3.</w:t>
       </w:r>
       <w:r>
@@ -24868,16 +24989,7 @@
           <w:szCs w:val="26"/>
           <w:lang w:val="en-US"/>
         </w:rPr>
-        <w:t xml:space="preserve">Trong chương này, đề tài đã tiến hành phân tích và thiết kế hệ thống tóm tắt văn bản dựa trên yêu cầu thực tế của bài toán. Trước hết, chương đã xác định được các yêu </w:t>
-      </w:r>
-      <w:r>
-        <w:rPr>
-          <w:sz w:val="26"/>
-          <w:szCs w:val="26"/>
-          <w:lang w:val="en-US"/>
-        </w:rPr>
-        <w:lastRenderedPageBreak/>
-        <w:t>cầu chức năng và phi chức năng mà hệ thống cần đáp ứng. Tiếp theo, tác nhân và các ca sử dụng chính của hệ thống đã được làm rõ nhằm mô tả cách người dùng tương tác với chương trình.</w:t>
+        <w:t>Trong chương này, đề tài đã tiến hành phân tích và thiết kế hệ thống tóm tắt văn bản dựa trên yêu cầu thực tế của bài toán. Trước hết, chương đã xác định được các yêu cầu chức năng và phi chức năng mà hệ thống cần đáp ứng. Tiếp theo, tác nhân và các ca sử dụng chính của hệ thống đã được làm rõ nhằm mô tả cách người dùng tương tác với chương trình.</w:t>
       </w:r>
     </w:p>
     <w:p>
@@ -25280,6 +25392,7 @@
           <w:szCs w:val="26"/>
           <w:lang w:val="en-US"/>
         </w:rPr>
+        <w:lastRenderedPageBreak/>
         <w:drawing>
           <wp:inline distT="0" distB="0" distL="0" distR="0" wp14:anchorId="1649710F" wp14:editId="76484040">
             <wp:extent cx="2229161" cy="1247949"/>
@@ -25357,7 +25470,6 @@
           <w:szCs w:val="26"/>
           <w:lang w:val="en-US"/>
         </w:rPr>
-        <w:lastRenderedPageBreak/>
         <w:tab/>
       </w:r>
       <w:r>
@@ -25692,6 +25804,20 @@
     </w:p>
     <w:p>
       <w:pPr>
+        <w:tabs>
+          <w:tab w:val="left" w:pos="567"/>
+        </w:tabs>
+        <w:spacing w:before="120"/>
+        <w:ind w:left="720"/>
+        <w:rPr>
+          <w:sz w:val="26"/>
+          <w:szCs w:val="26"/>
+          <w:lang w:val="en-US"/>
+        </w:rPr>
+      </w:pPr>
+    </w:p>
+    <w:p>
+      <w:pPr>
         <w:pStyle w:val="Heading2"/>
         <w:rPr>
           <w:rFonts w:ascii="Times New Roman" w:hAnsi="Times New Roman" w:cs="Times New Roman"/>
@@ -25712,6 +25838,7 @@
           <w:szCs w:val="28"/>
           <w:lang w:val="en-US"/>
         </w:rPr>
+        <w:lastRenderedPageBreak/>
         <w:t>4.3. Cài đặt module giao diện và điều phối</w:t>
       </w:r>
       <w:bookmarkEnd w:id="94"/>
@@ -25771,7 +25898,23 @@
           <w:szCs w:val="26"/>
           <w:lang w:val="en-US"/>
         </w:rPr>
-        <w:t>Ngay từ đầu chương trình, hệ thống định nghĩa ba mô hình mà người dùng có thể lựa chọn:</w:t>
+        <w:t xml:space="preserve">Ngay từ đầu chương trình, hệ thống định nghĩa </w:t>
+      </w:r>
+      <w:r>
+        <w:rPr>
+          <w:sz w:val="26"/>
+          <w:szCs w:val="26"/>
+          <w:lang w:val="en-US"/>
+        </w:rPr>
+        <w:t>hai</w:t>
+      </w:r>
+      <w:r>
+        <w:rPr>
+          <w:sz w:val="26"/>
+          <w:szCs w:val="26"/>
+          <w:lang w:val="en-US"/>
+        </w:rPr>
+        <w:t xml:space="preserve"> mô hình mà người dùng có thể lựa chọn:</w:t>
       </w:r>
     </w:p>
     <w:p>
@@ -25842,7 +25985,6 @@
           <w:szCs w:val="26"/>
           <w:lang w:val="en-US"/>
         </w:rPr>
-        <w:lastRenderedPageBreak/>
         <w:tab/>
       </w:r>
       <w:r>
@@ -26297,6 +26439,7 @@
           <w:szCs w:val="26"/>
           <w:lang w:val="en-US"/>
         </w:rPr>
+        <w:lastRenderedPageBreak/>
         <w:t>Về Ứng Dụng</w:t>
       </w:r>
     </w:p>
@@ -26389,7 +26532,6 @@
           <w:szCs w:val="28"/>
           <w:lang w:val="en-US"/>
         </w:rPr>
-        <w:lastRenderedPageBreak/>
         <w:t>4.4. Cài đặt giao diện các chức năng chính</w:t>
       </w:r>
       <w:bookmarkEnd w:id="95"/>
@@ -26429,14 +26571,13 @@
       </w:pPr>
       <w:r>
         <w:rPr>
-          <w:noProof/>
           <w:lang w:val="en-US"/>
         </w:rPr>
         <w:drawing>
-          <wp:inline distT="0" distB="0" distL="0" distR="0" wp14:anchorId="3336F3CA" wp14:editId="4BBA1587">
-            <wp:extent cx="5943600" cy="2428240"/>
+          <wp:inline distT="0" distB="0" distL="0" distR="0" wp14:anchorId="5FC5B447" wp14:editId="1BC38F08">
+            <wp:extent cx="5791835" cy="2865755"/>
             <wp:effectExtent l="0" t="0" r="0" b="0"/>
-            <wp:docPr id="457244232" name="Picture 1"/>
+            <wp:docPr id="1222246211" name="Picture 1"/>
             <wp:cNvGraphicFramePr>
               <a:graphicFrameLocks xmlns:a="http://schemas.openxmlformats.org/drawingml/2006/main" noChangeAspect="1"/>
             </wp:cNvGraphicFramePr>
@@ -26444,7 +26585,7 @@
               <a:graphicData uri="http://schemas.openxmlformats.org/drawingml/2006/picture">
                 <pic:pic xmlns:pic="http://schemas.openxmlformats.org/drawingml/2006/picture">
                   <pic:nvPicPr>
-                    <pic:cNvPr id="457244232" name=""/>
+                    <pic:cNvPr id="1222246211" name=""/>
                     <pic:cNvPicPr/>
                   </pic:nvPicPr>
                   <pic:blipFill>
@@ -26456,7 +26597,7 @@
                   <pic:spPr>
                     <a:xfrm>
                       <a:off x="0" y="0"/>
-                      <a:ext cx="5943600" cy="2428240"/>
+                      <a:ext cx="5791835" cy="2865755"/>
                     </a:xfrm>
                     <a:prstGeom prst="rect">
                       <a:avLst/>
@@ -26530,7 +26671,15 @@
           <w:szCs w:val="26"/>
           <w:lang w:val="en-US"/>
         </w:rPr>
-        <w:t>xử lý nhanh,</w:t>
+        <w:t>xử lý nhanh</w:t>
+      </w:r>
+      <w:r>
+        <w:rPr>
+          <w:sz w:val="26"/>
+          <w:szCs w:val="26"/>
+          <w:lang w:val="en-US"/>
+        </w:rPr>
+        <w:t>,</w:t>
       </w:r>
     </w:p>
     <w:p>
@@ -26555,7 +26704,15 @@
           <w:szCs w:val="26"/>
           <w:lang w:val="en-US"/>
         </w:rPr>
-        <w:t>tóm tắt chính xác,</w:t>
+        <w:t>tóm tắt chính xác</w:t>
+      </w:r>
+      <w:r>
+        <w:rPr>
+          <w:sz w:val="26"/>
+          <w:szCs w:val="26"/>
+          <w:lang w:val="en-US"/>
+        </w:rPr>
+        <w:t>,</w:t>
       </w:r>
     </w:p>
     <w:p>
@@ -26670,14 +26827,13 @@
       </w:pPr>
       <w:r>
         <w:rPr>
-          <w:noProof/>
           <w:lang w:val="en-US"/>
         </w:rPr>
         <w:drawing>
-          <wp:inline distT="0" distB="0" distL="0" distR="0" wp14:anchorId="09037D1D" wp14:editId="4E457F27">
-            <wp:extent cx="5943600" cy="2460625"/>
+          <wp:inline distT="0" distB="0" distL="0" distR="0" wp14:anchorId="49D08333" wp14:editId="1AFA20AE">
+            <wp:extent cx="5791835" cy="3009265"/>
             <wp:effectExtent l="0" t="0" r="0" b="0"/>
-            <wp:docPr id="140357965" name="Picture 1"/>
+            <wp:docPr id="346969990" name="Picture 1"/>
             <wp:cNvGraphicFramePr>
               <a:graphicFrameLocks xmlns:a="http://schemas.openxmlformats.org/drawingml/2006/main" noChangeAspect="1"/>
             </wp:cNvGraphicFramePr>
@@ -26685,7 +26841,7 @@
               <a:graphicData uri="http://schemas.openxmlformats.org/drawingml/2006/picture">
                 <pic:pic xmlns:pic="http://schemas.openxmlformats.org/drawingml/2006/picture">
                   <pic:nvPicPr>
-                    <pic:cNvPr id="140357965" name=""/>
+                    <pic:cNvPr id="346969990" name=""/>
                     <pic:cNvPicPr/>
                   </pic:nvPicPr>
                   <pic:blipFill>
@@ -26697,7 +26853,7 @@
                   <pic:spPr>
                     <a:xfrm>
                       <a:off x="0" y="0"/>
-                      <a:ext cx="5943600" cy="2460625"/>
+                      <a:ext cx="5791835" cy="3009265"/>
                     </a:xfrm>
                     <a:prstGeom prst="rect">
                       <a:avLst/>
@@ -27083,14 +27239,13 @@
       </w:pPr>
       <w:r>
         <w:rPr>
-          <w:noProof/>
           <w:lang w:val="en-US"/>
         </w:rPr>
         <w:drawing>
-          <wp:inline distT="0" distB="0" distL="0" distR="0" wp14:anchorId="107AD6F6" wp14:editId="673D6EBA">
-            <wp:extent cx="5943600" cy="2459355"/>
+          <wp:inline distT="0" distB="0" distL="0" distR="0" wp14:anchorId="42C34BB6" wp14:editId="58C663D3">
+            <wp:extent cx="5791835" cy="3825875"/>
             <wp:effectExtent l="0" t="0" r="0" b="0"/>
-            <wp:docPr id="1158610949" name="Picture 1"/>
+            <wp:docPr id="61227515" name="Picture 1"/>
             <wp:cNvGraphicFramePr>
               <a:graphicFrameLocks xmlns:a="http://schemas.openxmlformats.org/drawingml/2006/main" noChangeAspect="1"/>
             </wp:cNvGraphicFramePr>
@@ -27098,7 +27253,7 @@
               <a:graphicData uri="http://schemas.openxmlformats.org/drawingml/2006/picture">
                 <pic:pic xmlns:pic="http://schemas.openxmlformats.org/drawingml/2006/picture">
                   <pic:nvPicPr>
-                    <pic:cNvPr id="1158610949" name=""/>
+                    <pic:cNvPr id="61227515" name=""/>
                     <pic:cNvPicPr/>
                   </pic:nvPicPr>
                   <pic:blipFill>
@@ -27110,7 +27265,7 @@
                   <pic:spPr>
                     <a:xfrm>
                       <a:off x="0" y="0"/>
-                      <a:ext cx="5943600" cy="2459355"/>
+                      <a:ext cx="5791835" cy="3825875"/>
                     </a:xfrm>
                     <a:prstGeom prst="rect">
                       <a:avLst/>
@@ -27367,14 +27522,13 @@
       </w:pPr>
       <w:r>
         <w:rPr>
-          <w:noProof/>
           <w:lang w:val="en-US"/>
         </w:rPr>
         <w:drawing>
-          <wp:inline distT="0" distB="0" distL="0" distR="0" wp14:anchorId="3F352879" wp14:editId="169D7CEE">
-            <wp:extent cx="5943600" cy="2720340"/>
+          <wp:inline distT="0" distB="0" distL="0" distR="0" wp14:anchorId="57A9EBC9" wp14:editId="5D8BDCC7">
+            <wp:extent cx="5791835" cy="3940810"/>
             <wp:effectExtent l="0" t="0" r="0" b="0"/>
-            <wp:docPr id="1239237189" name="Picture 1"/>
+            <wp:docPr id="161056080" name="Picture 1"/>
             <wp:cNvGraphicFramePr>
               <a:graphicFrameLocks xmlns:a="http://schemas.openxmlformats.org/drawingml/2006/main" noChangeAspect="1"/>
             </wp:cNvGraphicFramePr>
@@ -27382,7 +27536,7 @@
               <a:graphicData uri="http://schemas.openxmlformats.org/drawingml/2006/picture">
                 <pic:pic xmlns:pic="http://schemas.openxmlformats.org/drawingml/2006/picture">
                   <pic:nvPicPr>
-                    <pic:cNvPr id="1239237189" name=""/>
+                    <pic:cNvPr id="161056080" name=""/>
                     <pic:cNvPicPr/>
                   </pic:nvPicPr>
                   <pic:blipFill>
@@ -27394,7 +27548,7 @@
                   <pic:spPr>
                     <a:xfrm>
                       <a:off x="0" y="0"/>
-                      <a:ext cx="5943600" cy="2720340"/>
+                      <a:ext cx="5791835" cy="3940810"/>
                     </a:xfrm>
                     <a:prstGeom prst="rect">
                       <a:avLst/>
@@ -27422,7 +27576,23 @@
           <w:szCs w:val="26"/>
           <w:lang w:val="en-US"/>
         </w:rPr>
-        <w:t>Hình 4.5 giao diện trang về ứng dụng</w:t>
+        <w:t>Hình 4.5</w:t>
+      </w:r>
+      <w:r>
+        <w:rPr>
+          <w:sz w:val="26"/>
+          <w:szCs w:val="26"/>
+          <w:lang w:val="en-US"/>
+        </w:rPr>
+        <w:t>.1</w:t>
+      </w:r>
+      <w:r>
+        <w:rPr>
+          <w:sz w:val="26"/>
+          <w:szCs w:val="26"/>
+          <w:lang w:val="en-US"/>
+        </w:rPr>
+        <w:t xml:space="preserve"> giao diện trang về ứng dụng</w:t>
       </w:r>
     </w:p>
     <w:p>
@@ -27619,27 +27789,6 @@
           <w:lang w:val="en-US"/>
         </w:rPr>
         <w:t>có yêu cầu phần cứng và ước lượng hiệu năng.</w:t>
-      </w:r>
-    </w:p>
-    <w:p>
-      <w:pPr>
-        <w:tabs>
-          <w:tab w:val="left" w:pos="567"/>
-        </w:tabs>
-        <w:spacing w:before="120"/>
-        <w:rPr>
-          <w:sz w:val="26"/>
-          <w:szCs w:val="26"/>
-          <w:lang w:val="en-US"/>
-        </w:rPr>
-      </w:pPr>
-      <w:r>
-        <w:rPr>
-          <w:sz w:val="26"/>
-          <w:szCs w:val="26"/>
-          <w:lang w:val="en-US"/>
-        </w:rPr>
-        <w:t>Phần này rất hữu ích nếu bạn muốn đưa vào báo cáo nội dung giới thiệu sản phẩm và đặc điểm kỹ thuật theo đúng repo thật.</w:t>
       </w:r>
     </w:p>
     <w:p>
@@ -27763,6 +27912,7 @@
           <w:szCs w:val="26"/>
           <w:lang w:val="en-US"/>
         </w:rPr>
+        <w:lastRenderedPageBreak/>
         <w:t>đếm token,</w:t>
       </w:r>
     </w:p>
@@ -27838,7 +27988,6 @@
           <w:szCs w:val="26"/>
           <w:lang w:val="en-US"/>
         </w:rPr>
-        <w:lastRenderedPageBreak/>
         <w:t>sinh bản tóm tắt cho từng chunk,</w:t>
       </w:r>
     </w:p>
@@ -28293,6 +28442,7 @@
           <w:szCs w:val="26"/>
           <w:lang w:val="en-US"/>
         </w:rPr>
+        <w:lastRenderedPageBreak/>
         <w:tab/>
       </w:r>
       <w:r>
@@ -28326,7 +28476,6 @@
           <w:szCs w:val="28"/>
           <w:lang w:val="en-US"/>
         </w:rPr>
-        <w:lastRenderedPageBreak/>
         <w:t>4.6. Mô tả chi tiết luồng xử lý chương trình</w:t>
       </w:r>
       <w:bookmarkEnd w:id="105"/>
@@ -29027,6 +29176,7 @@
           <w:szCs w:val="26"/>
           <w:lang w:val="en-US"/>
         </w:rPr>
+        <w:lastRenderedPageBreak/>
         <w:t>Bước 6: Hiển thị kết quả</w:t>
       </w:r>
     </w:p>
@@ -29073,7 +29223,6 @@
           <w:szCs w:val="26"/>
           <w:lang w:val="en-US"/>
         </w:rPr>
-        <w:lastRenderedPageBreak/>
         <w:t>bản tóm tắt cuối cùng,</w:t>
       </w:r>
     </w:p>
@@ -29549,7 +29698,23 @@
           <w:szCs w:val="26"/>
           <w:lang w:val="en-US"/>
         </w:rPr>
-        <w:t>Hệ thống không cố định một mô hình duy nhất mà cho phép người dùng chọn giữa ba mô hình khác nhau thuộc hai họ kiến trúc Transformer là T5 và BART. Điều này làm tăng tính linh hoạt và cho phép so sánh giữa tốc độ và chất lượng.</w:t>
+        <w:t xml:space="preserve">Hệ thống không cố định một mô hình duy nhất mà cho phép người dùng chọn giữa </w:t>
+      </w:r>
+      <w:r>
+        <w:rPr>
+          <w:sz w:val="26"/>
+          <w:szCs w:val="26"/>
+          <w:lang w:val="en-US"/>
+        </w:rPr>
+        <w:t>hai</w:t>
+      </w:r>
+      <w:r>
+        <w:rPr>
+          <w:sz w:val="26"/>
+          <w:szCs w:val="26"/>
+          <w:lang w:val="en-US"/>
+        </w:rPr>
+        <w:t xml:space="preserve"> mô hình khác nhau thuộc hai họ kiến trúc Transformer là T5 và BART. Điều này làm tăng tính linh hoạt và cho phép so sánh giữa tốc độ và chất lượng.</w:t>
       </w:r>
     </w:p>
     <w:p>
@@ -29600,7 +29765,16 @@
           <w:szCs w:val="26"/>
           <w:lang w:val="en-US"/>
         </w:rPr>
-        <w:t>Đây là đặc điểm kỹ thuật nổi bật nhất của hệ thống. Với các mô hình Transformer, đầu vào thường bị giới hạn số token. Repo khắc phục điểm này bằng cách:</w:t>
+        <w:t xml:space="preserve">Đây là đặc điểm kỹ thuật nổi bật nhất của hệ thống. Với các mô hình </w:t>
+      </w:r>
+      <w:r>
+        <w:rPr>
+          <w:sz w:val="26"/>
+          <w:szCs w:val="26"/>
+          <w:lang w:val="en-US"/>
+        </w:rPr>
+        <w:lastRenderedPageBreak/>
+        <w:t>Transformer, đầu vào thường bị giới hạn số token. Repo khắc phục điểm này bằng cách:</w:t>
       </w:r>
     </w:p>
     <w:p>
@@ -29650,7 +29824,6 @@
           <w:szCs w:val="26"/>
           <w:lang w:val="en-US"/>
         </w:rPr>
-        <w:lastRenderedPageBreak/>
         <w:t>tóm tắt từng chunk,</w:t>
       </w:r>
     </w:p>
@@ -30231,6 +30404,7 @@
           <w:szCs w:val="26"/>
           <w:lang w:val="en-US"/>
         </w:rPr>
+        <w:lastRenderedPageBreak/>
         <w:t>Chạy ứng dụng bằng streamlit run app.py.</w:t>
       </w:r>
     </w:p>
@@ -30260,16 +30434,7 @@
           <w:szCs w:val="26"/>
           <w:lang w:val="en-US"/>
         </w:rPr>
-        <w:t xml:space="preserve">Sau khi khởi động thành công, hệ thống sẽ chạy trên địa chỉ local mặc định của Streamlit. Trong lần chạy đầu tiên, mô hình sẽ được tải từ Hugging Face nên thời gian </w:t>
-      </w:r>
-      <w:r>
-        <w:rPr>
-          <w:sz w:val="26"/>
-          <w:szCs w:val="26"/>
-          <w:lang w:val="en-US"/>
-        </w:rPr>
-        <w:lastRenderedPageBreak/>
-        <w:t xml:space="preserve">chờ có thể lâu hơn bình thường. Repo cũng nêu rõ rằng dung lượng mô hình có thể dao động từ khoảng 800MB đến 5GB tùy theo mô hình được chọn. </w:t>
+        <w:t xml:space="preserve">Sau khi khởi động thành công, hệ thống sẽ chạy trên địa chỉ local mặc định của Streamlit. Trong lần chạy đầu tiên, mô hình sẽ được tải từ Hugging Face nên thời gian chờ có thể lâu hơn bình thường. Repo cũng nêu rõ rằng dung lượng mô hình có thể dao động từ khoảng 800MB đến 5GB tùy theo mô hình được chọn. </w:t>
       </w:r>
     </w:p>
     <w:p>
@@ -30688,28 +30853,7 @@
           <w:szCs w:val="26"/>
           <w:lang w:val="en-US"/>
         </w:rPr>
-        <w:t>Chương đã mô tả chi tiết cấu trúc dự án, vai trò của từng tệp mã nguồn, cách tổ chức giao diện, cơ chế điều phối thao tác người dùng, cũng như cách cài đặt module xử lý tóm tắt trong summarizer.py. Đặc biệt, hệ thống có hỗ trợ chia nhỏ văn bản theo token để xử lý các đầu vào dài, đây là điểm kỹ thuật nổi bật và có giá trị thực tiễn cao. Ngoài ra, ứng dụng còn cho phép lựa chọn nhiều mô hình, hiển thị số token, thời gian xử lý và kết quả chi tiết cho từng chunk.</w:t>
-      </w:r>
-    </w:p>
-    <w:p>
-      <w:pPr>
-        <w:tabs>
-          <w:tab w:val="left" w:pos="567"/>
-        </w:tabs>
-        <w:spacing w:before="120"/>
-        <w:rPr>
-          <w:sz w:val="26"/>
-          <w:szCs w:val="26"/>
-          <w:lang w:val="en-US"/>
-        </w:rPr>
-      </w:pPr>
-      <w:r>
-        <w:rPr>
-          <w:sz w:val="26"/>
-          <w:szCs w:val="26"/>
-          <w:lang w:val="en-US"/>
-        </w:rPr>
-        <w:t xml:space="preserve">Từ những nội dung đã trình bày, có thể thấy hệ thống không chỉ đáp ứng được yêu cầu xây dựng một ứng dụng tóm tắt văn bản tự động mà còn thể hiện được tính hoàn chỉnh </w:t>
+        <w:t xml:space="preserve">Chương đã mô tả chi tiết cấu trúc dự án, vai trò của từng tệp mã nguồn, cách tổ chức giao diện, cơ chế điều phối thao tác người dùng, cũng như cách cài đặt module xử lý tóm tắt trong summarizer.py. Đặc biệt, hệ thống có hỗ trợ chia nhỏ văn bản theo token để xử lý các đầu vào dài, đây là điểm kỹ thuật nổi bật và có giá trị thực tiễn cao. Ngoài ra, ứng dụng còn cho phép lựa chọn nhiều mô hình, hiển thị số token, thời gian xử lý </w:t>
       </w:r>
       <w:r>
         <w:rPr>
@@ -30718,7 +30862,28 @@
           <w:lang w:val="en-US"/>
         </w:rPr>
         <w:lastRenderedPageBreak/>
-        <w:t>về mặt phần mềm. Đây là cơ sở để chuyển sang chương tiếp theo, trong đó sẽ trình bày kết quả thực nghiệm và đánh giá hiệu quả hoạt động của hệ thống.</w:t>
+        <w:t>và kết quả chi tiết cho từng chunk.</w:t>
+      </w:r>
+    </w:p>
+    <w:p>
+      <w:pPr>
+        <w:tabs>
+          <w:tab w:val="left" w:pos="567"/>
+        </w:tabs>
+        <w:spacing w:before="120"/>
+        <w:rPr>
+          <w:sz w:val="26"/>
+          <w:szCs w:val="26"/>
+          <w:lang w:val="en-US"/>
+        </w:rPr>
+      </w:pPr>
+      <w:r>
+        <w:rPr>
+          <w:sz w:val="26"/>
+          <w:szCs w:val="26"/>
+          <w:lang w:val="en-US"/>
+        </w:rPr>
+        <w:t>Từ những nội dung đã trình bày, có thể thấy hệ thống không chỉ đáp ứng được yêu cầu xây dựng một ứng dụng tóm tắt văn bản tự động mà còn thể hiện được tính hoàn chỉnh về mặt phần mềm. Đây là cơ sở để chuyển sang chương tiếp theo, trong đó sẽ trình bày kết quả thực nghiệm và đánh giá hiệu quả hoạt động của hệ thống.</w:t>
       </w:r>
     </w:p>
     <w:p>
@@ -31193,6 +31358,7 @@
           <w:szCs w:val="28"/>
           <w:lang w:val="en-US"/>
         </w:rPr>
+        <w:lastRenderedPageBreak/>
         <w:t>5.2. Dữ liệu thực nghiệm</w:t>
       </w:r>
       <w:bookmarkEnd w:id="118"/>
@@ -31223,16 +31389,7 @@
           <w:szCs w:val="26"/>
           <w:lang w:val="en-US"/>
         </w:rPr>
-        <w:t xml:space="preserve">Theo tài liệu trong repo và nội dung hiển thị trong giao diện ứng dụng, hệ thống hiện được xây dựng để xử lý văn bản tiếng Anh, trong khi giao diện người dùng được </w:t>
-      </w:r>
-      <w:r>
-        <w:rPr>
-          <w:sz w:val="26"/>
-          <w:szCs w:val="26"/>
-          <w:lang w:val="en-US"/>
-        </w:rPr>
-        <w:lastRenderedPageBreak/>
-        <w:t>thiết kế hoàn toàn bằng tiếng Việt. Vì vậy, dữ liệu thực nghiệm cần được lựa chọn theo đúng định hướng này để bảo đảm kết quả phản ánh đúng khả năng của hệ thống.</w:t>
+        <w:t>Theo tài liệu trong repo và nội dung hiển thị trong giao diện ứng dụng, hệ thống hiện được xây dựng để xử lý văn bản tiếng Anh, trong khi giao diện người dùng được thiết kế hoàn toàn bằng tiếng Việt. Vì vậy, dữ liệu thực nghiệm cần được lựa chọn theo đúng định hướng này để bảo đảm kết quả phản ánh đúng khả năng của hệ thống.</w:t>
       </w:r>
     </w:p>
     <w:p>
@@ -31806,6 +31963,7 @@
           <w:color w:val="auto"/>
           <w:lang w:val="en-US"/>
         </w:rPr>
+        <w:lastRenderedPageBreak/>
         <w:t>5.2.4. Dữ liệu kiểm thử lỗi</w:t>
       </w:r>
       <w:bookmarkEnd w:id="122"/>
@@ -31861,7 +32019,6 @@
           <w:szCs w:val="26"/>
           <w:lang w:val="en-US"/>
         </w:rPr>
-        <w:lastRenderedPageBreak/>
         <w:t>văn bản rỗng,</w:t>
       </w:r>
     </w:p>
@@ -32426,6 +32583,7 @@
           <w:color w:val="auto"/>
           <w:lang w:val="en-US"/>
         </w:rPr>
+        <w:lastRenderedPageBreak/>
         <w:t>5.3.3. Kiểm thử với văn bản ngắn</w:t>
       </w:r>
       <w:bookmarkEnd w:id="126"/>
@@ -32448,6 +32606,14 @@
           <w:szCs w:val="26"/>
           <w:lang w:val="en-US"/>
         </w:rPr>
+        <w:tab/>
+      </w:r>
+      <w:r>
+        <w:rPr>
+          <w:sz w:val="26"/>
+          <w:szCs w:val="26"/>
+          <w:lang w:val="en-US"/>
+        </w:rPr>
         <w:t>Kịch bản này dùng để kiểm tra trường hợp văn bản có số token nhỏ hơn giới hạn max_tokens. Hệ thống được kỳ vọng sẽ tóm tắt trực tiếp mà không cần chia chunk.</w:t>
       </w:r>
     </w:p>
@@ -32469,7 +32635,6 @@
           <w:szCs w:val="26"/>
           <w:lang w:val="en-US"/>
         </w:rPr>
-        <w:lastRenderedPageBreak/>
         <w:t>Kết quả mong đợi:</w:t>
       </w:r>
     </w:p>
@@ -33137,6 +33302,7 @@
           <w:szCs w:val="26"/>
           <w:lang w:val="en-US"/>
         </w:rPr>
+        <w:lastRenderedPageBreak/>
         <w:t>nội dung đầu vào được xóa,</w:t>
       </w:r>
     </w:p>
@@ -33187,7 +33353,6 @@
           <w:szCs w:val="26"/>
           <w:lang w:val="en-US"/>
         </w:rPr>
-        <w:lastRenderedPageBreak/>
         <w:t>người dùng có thể nhập văn bản mới để tiếp tục sử dụng.</w:t>
       </w:r>
     </w:p>
@@ -33225,6 +33390,14 @@
           <w:lang w:val="en-US"/>
         </w:rPr>
       </w:pPr>
+      <w:r>
+        <w:rPr>
+          <w:sz w:val="26"/>
+          <w:szCs w:val="26"/>
+          <w:lang w:val="en-US"/>
+        </w:rPr>
+        <w:tab/>
+      </w:r>
       <w:r>
         <w:rPr>
           <w:sz w:val="26"/>
@@ -33399,16 +33572,15 @@
         <w:rPr>
           <w:b/>
           <w:bCs/>
-          <w:noProof/>
           <w:sz w:val="26"/>
           <w:szCs w:val="26"/>
           <w:lang w:val="en-US"/>
         </w:rPr>
         <w:drawing>
-          <wp:inline distT="0" distB="0" distL="0" distR="0" wp14:anchorId="7C9622F4" wp14:editId="12C38404">
-            <wp:extent cx="5943600" cy="1994535"/>
+          <wp:inline distT="0" distB="0" distL="0" distR="0" wp14:anchorId="15D90335" wp14:editId="06C3B55F">
+            <wp:extent cx="5791835" cy="2853055"/>
             <wp:effectExtent l="0" t="0" r="0" b="0"/>
-            <wp:docPr id="535644685" name="Picture 1"/>
+            <wp:docPr id="1267526072" name="Picture 1"/>
             <wp:cNvGraphicFramePr>
               <a:graphicFrameLocks xmlns:a="http://schemas.openxmlformats.org/drawingml/2006/main" noChangeAspect="1"/>
             </wp:cNvGraphicFramePr>
@@ -33416,7 +33588,7 @@
               <a:graphicData uri="http://schemas.openxmlformats.org/drawingml/2006/picture">
                 <pic:pic xmlns:pic="http://schemas.openxmlformats.org/drawingml/2006/picture">
                   <pic:nvPicPr>
-                    <pic:cNvPr id="535644685" name=""/>
+                    <pic:cNvPr id="1267526072" name=""/>
                     <pic:cNvPicPr/>
                   </pic:nvPicPr>
                   <pic:blipFill>
@@ -33428,7 +33600,7 @@
                   <pic:spPr>
                     <a:xfrm>
                       <a:off x="0" y="0"/>
-                      <a:ext cx="5943600" cy="1994535"/>
+                      <a:ext cx="5791835" cy="2853055"/>
                     </a:xfrm>
                     <a:prstGeom prst="rect">
                       <a:avLst/>
@@ -33610,6 +33782,7 @@
           <w:szCs w:val="26"/>
           <w:lang w:val="en-US"/>
         </w:rPr>
+        <w:lastRenderedPageBreak/>
         <w:tab/>
       </w:r>
       <w:r>
@@ -33641,6 +33814,19 @@
         </w:rPr>
         <w:t>Kết quả này cho thấy repo không chỉ dừng lại ở một chương trình thử nghiệm xử lý backend mà đã được phát triển thành một ứng dụng web hoàn chỉnh ở mức cơ bản.</w:t>
       </w:r>
+    </w:p>
+    <w:p>
+      <w:pPr>
+        <w:tabs>
+          <w:tab w:val="left" w:pos="567"/>
+        </w:tabs>
+        <w:spacing w:before="120"/>
+        <w:rPr>
+          <w:sz w:val="26"/>
+          <w:szCs w:val="26"/>
+          <w:lang w:val="en-US"/>
+        </w:rPr>
+      </w:pPr>
     </w:p>
     <w:p>
       <w:pPr>
@@ -33660,7 +33846,6 @@
           <w:color w:val="auto"/>
           <w:lang w:val="en-US"/>
         </w:rPr>
-        <w:lastRenderedPageBreak/>
         <w:t>5.4.2. Kết quả tải mô hình</w:t>
       </w:r>
       <w:bookmarkEnd w:id="133"/>
@@ -33688,16 +33873,15 @@
       </w:r>
       <w:r>
         <w:rPr>
-          <w:noProof/>
           <w:sz w:val="26"/>
           <w:szCs w:val="26"/>
           <w:lang w:val="en-US"/>
         </w:rPr>
         <w:drawing>
-          <wp:inline distT="0" distB="0" distL="0" distR="0" wp14:anchorId="18CDD87B" wp14:editId="4D755511">
-            <wp:extent cx="5943600" cy="3106420"/>
+          <wp:inline distT="0" distB="0" distL="0" distR="0" wp14:anchorId="188DEA63" wp14:editId="30D39AFF">
+            <wp:extent cx="4420217" cy="4363059"/>
             <wp:effectExtent l="0" t="0" r="0" b="0"/>
-            <wp:docPr id="1468098064" name="Picture 1"/>
+            <wp:docPr id="1948803284" name="Picture 1"/>
             <wp:cNvGraphicFramePr>
               <a:graphicFrameLocks xmlns:a="http://schemas.openxmlformats.org/drawingml/2006/main" noChangeAspect="1"/>
             </wp:cNvGraphicFramePr>
@@ -33705,7 +33889,7 @@
               <a:graphicData uri="http://schemas.openxmlformats.org/drawingml/2006/picture">
                 <pic:pic xmlns:pic="http://schemas.openxmlformats.org/drawingml/2006/picture">
                   <pic:nvPicPr>
-                    <pic:cNvPr id="1468098064" name=""/>
+                    <pic:cNvPr id="1948803284" name=""/>
                     <pic:cNvPicPr/>
                   </pic:nvPicPr>
                   <pic:blipFill>
@@ -33717,7 +33901,7 @@
                   <pic:spPr>
                     <a:xfrm>
                       <a:off x="0" y="0"/>
-                      <a:ext cx="5943600" cy="3106420"/>
+                      <a:ext cx="4420217" cy="4363059"/>
                     </a:xfrm>
                     <a:prstGeom prst="rect">
                       <a:avLst/>
@@ -33920,6 +34104,7 @@
           <w:szCs w:val="26"/>
           <w:lang w:val="en-US"/>
         </w:rPr>
+        <w:lastRenderedPageBreak/>
         <w:tab/>
       </w:r>
       <w:r>
@@ -33930,126 +34115,6 @@
         </w:rPr>
         <w:t>Với môi trường triển khai hạn chế tài nguyên như Streamlit Cloud, mô hình t5-small cho thấy tính khả thi cao nhất. Trong khi đó, facebook/bart-large-cnn có thể tạo ra kết quả tốt hơn nhưng tiềm ẩn nguy cơ chậm hoặc vượt giới hạn bộ nhớ.</w:t>
       </w:r>
-    </w:p>
-    <w:p>
-      <w:pPr>
-        <w:tabs>
-          <w:tab w:val="left" w:pos="567"/>
-        </w:tabs>
-        <w:spacing w:before="120"/>
-        <w:rPr>
-          <w:b/>
-          <w:bCs/>
-          <w:sz w:val="26"/>
-          <w:szCs w:val="26"/>
-          <w:lang w:val="en-US"/>
-        </w:rPr>
-      </w:pPr>
-    </w:p>
-    <w:p>
-      <w:pPr>
-        <w:tabs>
-          <w:tab w:val="left" w:pos="567"/>
-        </w:tabs>
-        <w:spacing w:before="120"/>
-        <w:rPr>
-          <w:b/>
-          <w:bCs/>
-          <w:sz w:val="26"/>
-          <w:szCs w:val="26"/>
-          <w:lang w:val="en-US"/>
-        </w:rPr>
-      </w:pPr>
-    </w:p>
-    <w:p>
-      <w:pPr>
-        <w:tabs>
-          <w:tab w:val="left" w:pos="567"/>
-        </w:tabs>
-        <w:spacing w:before="120"/>
-        <w:rPr>
-          <w:b/>
-          <w:bCs/>
-          <w:sz w:val="26"/>
-          <w:szCs w:val="26"/>
-          <w:lang w:val="en-US"/>
-        </w:rPr>
-      </w:pPr>
-    </w:p>
-    <w:p>
-      <w:pPr>
-        <w:tabs>
-          <w:tab w:val="left" w:pos="567"/>
-        </w:tabs>
-        <w:spacing w:before="120"/>
-        <w:rPr>
-          <w:b/>
-          <w:bCs/>
-          <w:sz w:val="26"/>
-          <w:szCs w:val="26"/>
-          <w:lang w:val="en-US"/>
-        </w:rPr>
-      </w:pPr>
-    </w:p>
-    <w:p>
-      <w:pPr>
-        <w:tabs>
-          <w:tab w:val="left" w:pos="567"/>
-        </w:tabs>
-        <w:spacing w:before="120"/>
-        <w:rPr>
-          <w:b/>
-          <w:bCs/>
-          <w:sz w:val="26"/>
-          <w:szCs w:val="26"/>
-          <w:lang w:val="en-US"/>
-        </w:rPr>
-      </w:pPr>
-    </w:p>
-    <w:p>
-      <w:pPr>
-        <w:tabs>
-          <w:tab w:val="left" w:pos="567"/>
-        </w:tabs>
-        <w:spacing w:before="120"/>
-        <w:rPr>
-          <w:b/>
-          <w:bCs/>
-          <w:sz w:val="26"/>
-          <w:szCs w:val="26"/>
-          <w:lang w:val="en-US"/>
-        </w:rPr>
-      </w:pPr>
-    </w:p>
-    <w:p>
-      <w:pPr>
-        <w:tabs>
-          <w:tab w:val="left" w:pos="567"/>
-        </w:tabs>
-        <w:spacing w:before="120"/>
-        <w:rPr>
-          <w:b/>
-          <w:bCs/>
-          <w:sz w:val="26"/>
-          <w:szCs w:val="26"/>
-          <w:lang w:val="en-US"/>
-        </w:rPr>
-      </w:pPr>
-    </w:p>
-    <w:p>
-      <w:pPr>
-        <w:tabs>
-          <w:tab w:val="left" w:pos="567"/>
-        </w:tabs>
-        <w:spacing w:before="120"/>
-        <w:rPr>
-          <w:b/>
-          <w:bCs/>
-          <w:sz w:val="26"/>
-          <w:szCs w:val="26"/>
-          <w:lang w:val="en-US"/>
-        </w:rPr>
-      </w:pPr>
     </w:p>
     <w:p>
       <w:pPr>
@@ -34069,7 +34134,6 @@
           <w:color w:val="auto"/>
           <w:lang w:val="en-US"/>
         </w:rPr>
-        <w:lastRenderedPageBreak/>
         <w:t>5.4.3. Kết quả đếm token và gợi ý mô hình</w:t>
       </w:r>
       <w:bookmarkEnd w:id="134"/>
@@ -34089,16 +34153,15 @@
       </w:pPr>
       <w:r>
         <w:rPr>
-          <w:noProof/>
           <w:sz w:val="26"/>
           <w:szCs w:val="26"/>
           <w:lang w:val="en-US"/>
         </w:rPr>
         <w:drawing>
-          <wp:inline distT="0" distB="0" distL="0" distR="0" wp14:anchorId="0ACEE531" wp14:editId="5F6B291E">
-            <wp:extent cx="5943600" cy="2397125"/>
+          <wp:inline distT="0" distB="0" distL="0" distR="0" wp14:anchorId="68181044" wp14:editId="0E313C8F">
+            <wp:extent cx="5791835" cy="2184400"/>
             <wp:effectExtent l="0" t="0" r="0" b="0"/>
-            <wp:docPr id="1904184714" name="Picture 1"/>
+            <wp:docPr id="1879571309" name="Picture 1"/>
             <wp:cNvGraphicFramePr>
               <a:graphicFrameLocks xmlns:a="http://schemas.openxmlformats.org/drawingml/2006/main" noChangeAspect="1"/>
             </wp:cNvGraphicFramePr>
@@ -34106,7 +34169,7 @@
               <a:graphicData uri="http://schemas.openxmlformats.org/drawingml/2006/picture">
                 <pic:pic xmlns:pic="http://schemas.openxmlformats.org/drawingml/2006/picture">
                   <pic:nvPicPr>
-                    <pic:cNvPr id="1904184714" name=""/>
+                    <pic:cNvPr id="1879571309" name=""/>
                     <pic:cNvPicPr/>
                   </pic:nvPicPr>
                   <pic:blipFill>
@@ -34118,7 +34181,7 @@
                   <pic:spPr>
                     <a:xfrm>
                       <a:off x="0" y="0"/>
-                      <a:ext cx="5943600" cy="2397125"/>
+                      <a:ext cx="5791835" cy="2184400"/>
                     </a:xfrm>
                     <a:prstGeom prst="rect">
                       <a:avLst/>
@@ -34304,6 +34367,7 @@
           <w:color w:val="auto"/>
           <w:lang w:val="en-US"/>
         </w:rPr>
+        <w:lastRenderedPageBreak/>
         <w:t>5.4.4. Kết quả với văn bản ngắn</w:t>
       </w:r>
       <w:bookmarkEnd w:id="135"/>
@@ -34327,16 +34391,15 @@
         <w:rPr>
           <w:b/>
           <w:bCs/>
-          <w:noProof/>
           <w:sz w:val="26"/>
           <w:szCs w:val="26"/>
           <w:lang w:val="en-US"/>
         </w:rPr>
         <w:drawing>
-          <wp:inline distT="0" distB="0" distL="0" distR="0" wp14:anchorId="4D35BF33" wp14:editId="7A61BA28">
-            <wp:extent cx="5943600" cy="1289050"/>
+          <wp:inline distT="0" distB="0" distL="0" distR="0" wp14:anchorId="6200FBC0" wp14:editId="36CA7315">
+            <wp:extent cx="5791835" cy="2935605"/>
             <wp:effectExtent l="0" t="0" r="0" b="0"/>
-            <wp:docPr id="362769774" name="Picture 1"/>
+            <wp:docPr id="177010865" name="Picture 1"/>
             <wp:cNvGraphicFramePr>
               <a:graphicFrameLocks xmlns:a="http://schemas.openxmlformats.org/drawingml/2006/main" noChangeAspect="1"/>
             </wp:cNvGraphicFramePr>
@@ -34344,7 +34407,7 @@
               <a:graphicData uri="http://schemas.openxmlformats.org/drawingml/2006/picture">
                 <pic:pic xmlns:pic="http://schemas.openxmlformats.org/drawingml/2006/picture">
                   <pic:nvPicPr>
-                    <pic:cNvPr id="362769774" name=""/>
+                    <pic:cNvPr id="177010865" name=""/>
                     <pic:cNvPicPr/>
                   </pic:nvPicPr>
                   <pic:blipFill>
@@ -34356,7 +34419,7 @@
                   <pic:spPr>
                     <a:xfrm>
                       <a:off x="0" y="0"/>
-                      <a:ext cx="5943600" cy="1289050"/>
+                      <a:ext cx="5791835" cy="2935605"/>
                     </a:xfrm>
                     <a:prstGeom prst="rect">
                       <a:avLst/>
@@ -34509,7 +34572,6 @@
           <w:szCs w:val="26"/>
           <w:lang w:val="en-US"/>
         </w:rPr>
-        <w:lastRenderedPageBreak/>
         <w:t>final_summary chính là kết quả cuối cùng hiển thị trên giao diện</w:t>
       </w:r>
     </w:p>
@@ -34533,6 +34595,19 @@
         </w:rPr>
         <w:t>Trong trường hợp này, tốc độ xử lý nhanh, giao diện hiển thị đơn giản và người dùng dễ quan sát kết quả.</w:t>
       </w:r>
+    </w:p>
+    <w:p>
+      <w:pPr>
+        <w:tabs>
+          <w:tab w:val="left" w:pos="567"/>
+        </w:tabs>
+        <w:spacing w:before="120"/>
+        <w:rPr>
+          <w:sz w:val="26"/>
+          <w:szCs w:val="26"/>
+          <w:lang w:val="en-US"/>
+        </w:rPr>
+      </w:pPr>
     </w:p>
     <w:p>
       <w:pPr>
@@ -34552,6 +34627,7 @@
           <w:color w:val="auto"/>
           <w:lang w:val="en-US"/>
         </w:rPr>
+        <w:lastRenderedPageBreak/>
         <w:t>5.4.5. Kết quả với văn bản dài</w:t>
       </w:r>
       <w:bookmarkEnd w:id="136"/>
@@ -34575,16 +34651,15 @@
         <w:rPr>
           <w:b/>
           <w:bCs/>
-          <w:noProof/>
           <w:sz w:val="26"/>
           <w:szCs w:val="26"/>
           <w:lang w:val="en-US"/>
         </w:rPr>
         <w:drawing>
-          <wp:inline distT="0" distB="0" distL="0" distR="0" wp14:anchorId="3737C9BA" wp14:editId="059C7A96">
-            <wp:extent cx="5943600" cy="2239010"/>
+          <wp:inline distT="0" distB="0" distL="0" distR="0" wp14:anchorId="7CAAD6CC" wp14:editId="08BFE93B">
+            <wp:extent cx="5791835" cy="2162175"/>
             <wp:effectExtent l="0" t="0" r="0" b="0"/>
-            <wp:docPr id="418916414" name="Picture 1"/>
+            <wp:docPr id="1833169253" name="Picture 1"/>
             <wp:cNvGraphicFramePr>
               <a:graphicFrameLocks xmlns:a="http://schemas.openxmlformats.org/drawingml/2006/main" noChangeAspect="1"/>
             </wp:cNvGraphicFramePr>
@@ -34592,7 +34667,7 @@
               <a:graphicData uri="http://schemas.openxmlformats.org/drawingml/2006/picture">
                 <pic:pic xmlns:pic="http://schemas.openxmlformats.org/drawingml/2006/picture">
                   <pic:nvPicPr>
-                    <pic:cNvPr id="418916414" name=""/>
+                    <pic:cNvPr id="1833169253" name=""/>
                     <pic:cNvPicPr/>
                   </pic:nvPicPr>
                   <pic:blipFill>
@@ -34604,7 +34679,7 @@
                   <pic:spPr>
                     <a:xfrm>
                       <a:off x="0" y="0"/>
-                      <a:ext cx="5943600" cy="2239010"/>
+                      <a:ext cx="5791835" cy="2162175"/>
                     </a:xfrm>
                     <a:prstGeom prst="rect">
                       <a:avLst/>
@@ -34958,6 +35033,19 @@
     </w:p>
     <w:p>
       <w:pPr>
+        <w:tabs>
+          <w:tab w:val="left" w:pos="567"/>
+        </w:tabs>
+        <w:spacing w:before="120"/>
+        <w:rPr>
+          <w:sz w:val="26"/>
+          <w:szCs w:val="26"/>
+          <w:lang w:val="en-US"/>
+        </w:rPr>
+      </w:pPr>
+    </w:p>
+    <w:p>
+      <w:pPr>
         <w:pStyle w:val="Heading3"/>
         <w:rPr>
           <w:b/>
@@ -35021,7 +35109,6 @@
           <w:szCs w:val="26"/>
           <w:lang w:val="en-US"/>
         </w:rPr>
-        <w:lastRenderedPageBreak/>
         <w:t>thời gian xử lý,</w:t>
       </w:r>
     </w:p>
@@ -35072,6 +35159,7 @@
           <w:szCs w:val="26"/>
           <w:lang w:val="en-US"/>
         </w:rPr>
+        <w:lastRenderedPageBreak/>
         <w:t>chi tiết chunk,</w:t>
       </w:r>
     </w:p>
@@ -35581,16 +35669,7 @@
           <w:szCs w:val="26"/>
           <w:lang w:val="en-US"/>
         </w:rPr>
-        <w:t xml:space="preserve">mức độ rút gọn tương đối thông qua so sánh độ dài văn bản đầu vào và bản tóm </w:t>
-      </w:r>
-      <w:r>
-        <w:rPr>
-          <w:sz w:val="26"/>
-          <w:szCs w:val="26"/>
-          <w:lang w:val="en-US"/>
-        </w:rPr>
-        <w:lastRenderedPageBreak/>
-        <w:t>tắt đầu ra.</w:t>
+        <w:t>mức độ rút gọn tương đối thông qua so sánh độ dài văn bản đầu vào và bản tóm tắt đầu ra.</w:t>
       </w:r>
     </w:p>
     <w:p>
@@ -35636,6 +35715,7 @@
           <w:szCs w:val="26"/>
           <w:lang w:val="en-US"/>
         </w:rPr>
+        <w:lastRenderedPageBreak/>
         <w:t>số token tăng,</w:t>
       </w:r>
     </w:p>
@@ -36234,16 +36314,7 @@
           <w:szCs w:val="26"/>
           <w:lang w:val="en-US"/>
         </w:rPr>
-        <w:t xml:space="preserve">Đây là ưu điểm quan trọng nhất. Thay vì bị giới hạn bởi kích thước đầu vào của </w:t>
-      </w:r>
-      <w:r>
-        <w:rPr>
-          <w:sz w:val="26"/>
-          <w:szCs w:val="26"/>
-          <w:lang w:val="en-US"/>
-        </w:rPr>
-        <w:lastRenderedPageBreak/>
-        <w:t>mô hình, hệ thống có thể chia văn bản dài thành nhiều phần nhỏ để xử lý, sau đó tổng hợp lại. Điều này làm tăng đáng kể khả năng ứng dụng thực tế của chương trình.</w:t>
+        <w:t>Đây là ưu điểm quan trọng nhất. Thay vì bị giới hạn bởi kích thước đầu vào của mô hình, hệ thống có thể chia văn bản dài thành nhiều phần nhỏ để xử lý, sau đó tổng hợp lại. Điều này làm tăng đáng kể khả năng ứng dụng thực tế của chương trình.</w:t>
       </w:r>
     </w:p>
     <w:p>
@@ -36264,6 +36335,7 @@
           <w:color w:val="auto"/>
           <w:lang w:val="en-US"/>
         </w:rPr>
+        <w:lastRenderedPageBreak/>
         <w:t>5.6.4. Có khả năng hiển thị thông tin hỗ trợ đánh giá</w:t>
       </w:r>
       <w:bookmarkEnd w:id="146"/>
@@ -36849,16 +36921,7 @@
           <w:szCs w:val="26"/>
           <w:lang w:val="en-US"/>
         </w:rPr>
-        <w:t xml:space="preserve">Hệ thống hiện sử dụng hoàn toàn các mô hình pretrained từ Hugging Face và chưa có bước huấn luyện hoặc tinh chỉnh riêng cho miền dữ liệu cụ thể. Vì vậy, chất </w:t>
-      </w:r>
-      <w:r>
-        <w:rPr>
-          <w:sz w:val="26"/>
-          <w:szCs w:val="26"/>
-          <w:lang w:val="en-US"/>
-        </w:rPr>
-        <w:lastRenderedPageBreak/>
-        <w:t>lượng tóm tắt phụ thuộc lớn vào mô hình có sẵn và có thể chưa tối ưu cho mọi loại văn bản.</w:t>
+        <w:t>Hệ thống hiện sử dụng hoàn toàn các mô hình pretrained từ Hugging Face và chưa có bước huấn luyện hoặc tinh chỉnh riêng cho miền dữ liệu cụ thể. Vì vậy, chất lượng tóm tắt phụ thuộc lớn vào mô hình có sẵn và có thể chưa tối ưu cho mọi loại văn bản.</w:t>
       </w:r>
     </w:p>
     <w:p>
@@ -36879,6 +36942,7 @@
           <w:color w:val="auto"/>
           <w:lang w:val="en-US"/>
         </w:rPr>
+        <w:lastRenderedPageBreak/>
         <w:t>5.7.3. Tốn tài nguyên khi dùng mô hình lớn</w:t>
       </w:r>
       <w:bookmarkEnd w:id="152"/>
@@ -37450,16 +37514,7 @@
           <w:szCs w:val="26"/>
           <w:lang w:val="en-US"/>
         </w:rPr>
-        <w:t xml:space="preserve">Nhìn chung, so với mục tiêu đồ án là xây dựng một hệ thống tóm tắt văn bản có thể vận hành thực tế, repo hiện tại đã đáp ứng khá tốt. Những phần còn thiếu chủ yếu là </w:t>
-      </w:r>
-      <w:r>
-        <w:rPr>
-          <w:sz w:val="26"/>
-          <w:szCs w:val="26"/>
-          <w:lang w:val="en-US"/>
-        </w:rPr>
-        <w:lastRenderedPageBreak/>
-        <w:t>các tính năng mở rộng hoặc tối ưu sâu hơn.</w:t>
+        <w:t>Nhìn chung, so với mục tiêu đồ án là xây dựng một hệ thống tóm tắt văn bản có thể vận hành thực tế, repo hiện tại đã đáp ứng khá tốt. Những phần còn thiếu chủ yếu là các tính năng mở rộng hoặc tối ưu sâu hơn.</w:t>
       </w:r>
     </w:p>
     <w:p>
@@ -37486,6 +37541,7 @@
           <w:szCs w:val="28"/>
           <w:lang w:val="en-US"/>
         </w:rPr>
+        <w:lastRenderedPageBreak/>
         <w:t>5.9. Kết luận chương</w:t>
       </w:r>
       <w:bookmarkEnd w:id="159"/>
@@ -37792,7 +37848,7 @@
           <w:szCs w:val="26"/>
           <w:lang w:val="en-US"/>
         </w:rPr>
-        <w:t xml:space="preserve">Bên cạnh đó, giao diện của hệ thống được xây dựng tương đối trực quan và dễ sử dụng. Người dùng có thể lựa chọn mô hình, cấu hình tham số, nhập văn bản, thực hiện </w:t>
+        <w:t xml:space="preserve">Bên cạnh đó, giao diện của hệ thống được xây dựng tương đối trực quan và dễ sử dụng. Người dùng có thể lựa chọn mô hình, cấu hình tham số, nhập văn bản, thực hiện tóm tắt và xem kết quả trực tiếp trên trình duyệt. Hệ thống cũng hỗ trợ hiển thị một số thông tin hữu ích như số token của văn bản gốc, thời gian xử lý, trạng thái chia chunk </w:t>
       </w:r>
       <w:r>
         <w:rPr>
@@ -37801,7 +37857,7 @@
           <w:lang w:val="en-US"/>
         </w:rPr>
         <w:lastRenderedPageBreak/>
-        <w:t>tóm tắt và xem kết quả trực tiếp trên trình duyệt. Hệ thống cũng hỗ trợ hiển thị một số thông tin hữu ích như số token của văn bản gốc, thời gian xử lý, trạng thái chia chunk và chi tiết bản tóm tắt của từng chunk.</w:t>
+        <w:t>và chi tiết bản tóm tắt của từng chunk.</w:t>
       </w:r>
     </w:p>
     <w:p>
@@ -38161,8 +38217,21 @@
           <w:szCs w:val="26"/>
           <w:lang w:val="en-US"/>
         </w:rPr>
-        <w:t xml:space="preserve">Hướng phát triển đầu tiên và quan trọng nhất là nâng cao khả năng hỗ trợ tiếng Việt. Hệ thống có thể được cải tiến bằng cách tích hợp các mô hình phù hợp hơn với tiếng Việt hoặc tiến hành fine-tune trên các bộ dữ liệu tóm tắt tiếng Việt, từ đó nâng </w:t>
-      </w:r>
+        <w:t>Hướng phát triển đầu tiên và quan trọng nhất là nâng cao khả năng hỗ trợ tiếng Việt. Hệ thống có thể được cải tiến bằng cách tích hợp các mô hình phù hợp hơn với tiếng Việt hoặc tiến hành fine-tune trên các bộ dữ liệu tóm tắt tiếng Việt, từ đó nâng cao chất lượng đầu ra cho người dùng trong nước.</w:t>
+      </w:r>
+    </w:p>
+    <w:p>
+      <w:pPr>
+        <w:tabs>
+          <w:tab w:val="left" w:pos="567"/>
+        </w:tabs>
+        <w:spacing w:before="120"/>
+        <w:rPr>
+          <w:sz w:val="26"/>
+          <w:szCs w:val="26"/>
+          <w:lang w:val="en-US"/>
+        </w:rPr>
+      </w:pPr>
       <w:r>
         <w:rPr>
           <w:sz w:val="26"/>
@@ -38170,27 +38239,6 @@
           <w:lang w:val="en-US"/>
         </w:rPr>
         <w:lastRenderedPageBreak/>
-        <w:t>cao chất lượng đầu ra cho người dùng trong nước.</w:t>
-      </w:r>
-    </w:p>
-    <w:p>
-      <w:pPr>
-        <w:tabs>
-          <w:tab w:val="left" w:pos="567"/>
-        </w:tabs>
-        <w:spacing w:before="120"/>
-        <w:rPr>
-          <w:sz w:val="26"/>
-          <w:szCs w:val="26"/>
-          <w:lang w:val="en-US"/>
-        </w:rPr>
-      </w:pPr>
-      <w:r>
-        <w:rPr>
-          <w:sz w:val="26"/>
-          <w:szCs w:val="26"/>
-          <w:lang w:val="en-US"/>
-        </w:rPr>
         <w:tab/>
       </w:r>
       <w:r>
@@ -38569,7 +38617,7 @@
           <w:szCs w:val="26"/>
           <w:lang w:val="en-US"/>
         </w:rPr>
-        <w:t xml:space="preserve">Mặc dù hệ thống vẫn còn những hạn chế nhất định, đặc biệt ở khả năng hỗ trợ tiếng Việt, cơ chế đánh giá tự động và tối ưu tài nguyên, nhưng những kết quả đạt được </w:t>
+        <w:t xml:space="preserve">Mặc dù hệ thống vẫn còn những hạn chế nhất định, đặc biệt ở khả năng hỗ trợ tiếng Việt, cơ chế đánh giá tự động và tối ưu tài nguyên, nhưng những kết quả đạt được cho thấy đề tài có nền tảng tốt để tiếp tục phát triển. Nếu được đầu tư thêm về dữ liệu, mô hình và hạ tầng triển khai, hệ thống hoàn toàn có thể được mở rộng thành một ứng </w:t>
       </w:r>
       <w:r>
         <w:rPr>
@@ -38578,7 +38626,7 @@
           <w:lang w:val="en-US"/>
         </w:rPr>
         <w:lastRenderedPageBreak/>
-        <w:t>cho thấy đề tài có nền tảng tốt để tiếp tục phát triển. Nếu được đầu tư thêm về dữ liệu, mô hình và hạ tầng triển khai, hệ thống hoàn toàn có thể được mở rộng thành một ứng dụng hoàn thiện hơn, phục vụ tốt hơn cho nhu cầu học tập, nghiên cứu và khai thác thông tin từ văn bản.</w:t>
+        <w:t>dụng hoàn thiện hơn, phục vụ tốt hơn cho nhu cầu học tập, nghiên cứu và khai thác thông tin từ văn bản.</w:t>
       </w:r>
     </w:p>
     <w:p>
@@ -38896,7 +38944,6 @@
     <w:sectPr>
       <w:pgSz w:w="12240" w:h="15840" w:code="1"/>
       <w:pgMar w:top="1418" w:right="1134" w:bottom="1418" w:left="1985" w:header="567" w:footer="567" w:gutter="0"/>
-      <w:pgNumType w:start="48"/>
       <w:cols w:space="720"/>
       <w:docGrid w:linePitch="360"/>
     </w:sectPr>
@@ -39078,7 +39125,7 @@
 <w:ftr xmlns:wpc="http://schemas.microsoft.com/office/word/2010/wordprocessingCanvas" xmlns:cx="http://schemas.microsoft.com/office/drawing/2014/chartex" xmlns:cx1="http://schemas.microsoft.com/office/drawing/2015/9/8/chartex" xmlns:cx2="http://schemas.microsoft.com/office/drawing/2015/10/21/chartex" xmlns:cx3="http://schemas.microsoft.com/office/drawing/2016/5/9/chartex" xmlns:cx4="http://schemas.microsoft.com/office/drawing/2016/5/10/chartex" xmlns:cx5="http://schemas.microsoft.com/office/drawing/2016/5/11/chartex" xmlns:cx6="http://schemas.microsoft.com/office/drawing/2016/5/12/chartex" xmlns:cx7="http://schemas.microsoft.com/office/drawing/2016/5/13/chartex" xmlns:cx8="http://schemas.microsoft.com/office/drawing/2016/5/14/chartex" xmlns:mc="http://schemas.openxmlformats.org/markup-compatibility/2006" xmlns:aink="http://schemas.microsoft.com/office/drawing/2016/ink" xmlns:am3d="http://schemas.microsoft.com/office/drawing/2017/model3d" xmlns:o="urn:schemas-microsoft-com:office:office" xmlns:oel="http://schemas.microsoft.com/office/2019/extlst" xmlns:r="http://schemas.openxmlformats.org/officeDocument/2006/relationships" xmlns:m="http://schemas.openxmlformats.org/officeDocument/2006/math" xmlns:v="urn:schemas-microsoft-com:vml" xmlns:wp14="http://schemas.microsoft.com/office/word/2010/wordprocessingDrawing" xmlns:wp="http://schemas.openxmlformats.org/drawingml/2006/wordprocessingDrawing" xmlns:w10="urn:schemas-microsoft-com:office:word" xmlns:w="http://schemas.openxmlformats.org/wordprocessingml/2006/main" xmlns:w14="http://schemas.microsoft.com/office/word/2010/wordml" xmlns:w15="http://schemas.microsoft.com/office/word/2012/wordml" xmlns:w16cex="http://schemas.microsoft.com/office/word/2018/wordml/cex" xmlns:w16cid="http://schemas.microsoft.com/office/word/2016/wordml/cid" xmlns:w16="http://schemas.microsoft.com/office/word/2018/wordml" xmlns:w16du="http://schemas.microsoft.com/office/word/2023/wordml/word16du" xmlns:w16sdtdh="http://schemas.microsoft.com/office/word/2020/wordml/sdtdatahash" xmlns:w16sdtfl="http://schemas.microsoft.com/office/word/2024/wordml/sdtformatlock" xmlns:w16se="http://schemas.microsoft.com/office/word/2015/wordml/symex" xmlns:wpg="http://schemas.microsoft.com/office/word/2010/wordprocessingGroup" xmlns:wpi="http://schemas.microsoft.com/office/word/2010/wordprocessingInk" xmlns:wne="http://schemas.microsoft.com/office/word/2006/wordml" xmlns:wps="http://schemas.microsoft.com/office/word/2010/wordprocessingShape" mc:Ignorable="w14 w15 w16se w16cid w16 w16cex w16sdtdh w16sdtfl w16du wp14">
   <w:sdt>
     <w:sdtPr>
-      <w:id w:val="1423679351"/>
+      <w:id w:val="-803769035"/>
       <w:docPartObj>
         <w:docPartGallery w:val="Page Numbers (Bottom of Page)"/>
         <w:docPartUnique/>

</xml_diff>